<commit_message>
Update READme, Update docs folder, Minor update to the code
</commit_message>
<xml_diff>
--- a/docs/1. Code Design and Configuration.docx
+++ b/docs/1. Code Design and Configuration.docx
@@ -108,6 +108,22 @@
           <w:szCs w:val="48"/>
         </w:rPr>
         <w:t>PROPOSED SPARK CONFIGURATIONS</w:t>
+      </w:r>
+    </w:p>
+    <w:p>
+      <w:pPr>
+        <w:jc w:val="center"/>
+        <w:rPr>
+          <w:sz w:val="48"/>
+          <w:szCs w:val="48"/>
+        </w:rPr>
+      </w:pPr>
+      <w:r>
+        <w:rPr>
+          <w:sz w:val="48"/>
+          <w:szCs w:val="48"/>
+        </w:rPr>
+        <w:t>(Alex Chan)</w:t>
       </w:r>
     </w:p>
     <w:p>
@@ -1686,7 +1702,43 @@
         <w:rPr>
           <w:rFonts w:ascii="Times New Roman" w:hAnsi="Times New Roman" w:cs="Times New Roman"/>
         </w:rPr>
-        <w:t>: detection events with geo location, camera, item, timestamp, and detection_oid that may contain duplicates.</w:t>
+        <w:t>: detection events with geo location</w:t>
+      </w:r>
+      <w:r>
+        <w:rPr>
+          <w:rFonts w:ascii="Times New Roman" w:hAnsi="Times New Roman" w:cs="Times New Roman"/>
+        </w:rPr>
+        <w:t>_oid</w:t>
+      </w:r>
+      <w:r>
+        <w:rPr>
+          <w:rFonts w:ascii="Times New Roman" w:hAnsi="Times New Roman" w:cs="Times New Roman"/>
+        </w:rPr>
+        <w:t>, camera</w:t>
+      </w:r>
+      <w:r>
+        <w:rPr>
+          <w:rFonts w:ascii="Times New Roman" w:hAnsi="Times New Roman" w:cs="Times New Roman"/>
+        </w:rPr>
+        <w:t>_video_oid</w:t>
+      </w:r>
+      <w:r>
+        <w:rPr>
+          <w:rFonts w:ascii="Times New Roman" w:hAnsi="Times New Roman" w:cs="Times New Roman"/>
+        </w:rPr>
+        <w:t>, item</w:t>
+      </w:r>
+      <w:r>
+        <w:rPr>
+          <w:rFonts w:ascii="Times New Roman" w:hAnsi="Times New Roman" w:cs="Times New Roman"/>
+        </w:rPr>
+        <w:t>_name</w:t>
+      </w:r>
+      <w:r>
+        <w:rPr>
+          <w:rFonts w:ascii="Times New Roman" w:hAnsi="Times New Roman" w:cs="Times New Roman"/>
+        </w:rPr>
+        <w:t>, timestamp, and detection_oid that may contain duplicates.</w:t>
       </w:r>
     </w:p>
     <w:p>
@@ -1712,21 +1764,7 @@
         <w:rPr>
           <w:rFonts w:ascii="Times New Roman" w:hAnsi="Times New Roman" w:cs="Times New Roman"/>
         </w:rPr>
-        <w:t xml:space="preserve">: lookup table mapping </w:t>
-      </w:r>
-      <w:proofErr w:type="spellStart"/>
-      <w:r>
-        <w:rPr>
-          <w:rFonts w:ascii="Times New Roman" w:hAnsi="Times New Roman" w:cs="Times New Roman"/>
-        </w:rPr>
-        <w:t>geographical_location_oid</w:t>
-      </w:r>
-      <w:proofErr w:type="spellEnd"/>
-      <w:r>
-        <w:rPr>
-          <w:rFonts w:ascii="Times New Roman" w:hAnsi="Times New Roman" w:cs="Times New Roman"/>
-        </w:rPr>
-        <w:t xml:space="preserve"> to human-readable location names.</w:t>
+        <w:t>: lookup table mapping geographical_location_oid to human-readable location names.</w:t>
       </w:r>
     </w:p>
     <w:p>
@@ -1888,16 +1926,8 @@
         <w:rPr>
           <w:rFonts w:ascii="Times New Roman" w:hAnsi="Times New Roman" w:cs="Times New Roman"/>
         </w:rPr>
-        <w:t xml:space="preserve"> </w:t>
-      </w:r>
-      <w:proofErr w:type="gramStart"/>
-      <w:r>
-        <w:rPr>
-          <w:rFonts w:ascii="Times New Roman" w:hAnsi="Times New Roman" w:cs="Times New Roman"/>
-        </w:rPr>
-        <w:t>explicit .join</w:t>
-      </w:r>
-      <w:proofErr w:type="gramEnd"/>
+        <w:t xml:space="preserve"> explicit .join</w:t>
+      </w:r>
       <w:r>
         <w:rPr>
           <w:rFonts w:ascii="Times New Roman" w:hAnsi="Times New Roman" w:cs="Times New Roman"/>
@@ -2142,15 +2172,7 @@
         <w:t xml:space="preserve">Util </w:t>
       </w:r>
       <w:r>
-        <w:t>– Utility classes/</w:t>
-      </w:r>
-      <w:proofErr w:type="spellStart"/>
-      <w:r>
-        <w:t>softwares</w:t>
-      </w:r>
-      <w:proofErr w:type="spellEnd"/>
-      <w:r>
-        <w:t xml:space="preserve"> that are not part of the business logic but serve as helpers and keeping out of concern from the Jobs package.</w:t>
+        <w:t>– Utility classes/softwares that are not part of the business logic but serve as helpers and keeping out of concern from the Jobs package.</w:t>
       </w:r>
       <w:r>
         <w:rPr>
@@ -2196,10 +2218,13 @@
           <w:szCs w:val="21"/>
           <w14:ligatures w14:val="none"/>
         </w:rPr>
-        <w:t xml:space="preserve">  </w:t>
-      </w:r>
-      <w:proofErr w:type="spellStart"/>
-      <w:r>
+        <w:t>  src/item_ranker/</w:t>
+      </w:r>
+    </w:p>
+    <w:p>
+      <w:pPr>
+        <w:shd w:val="clear" w:color="auto" w:fill="0D1117"/>
+        <w:spacing w:after="0" w:line="285" w:lineRule="atLeast"/>
         <w:rPr>
           <w:rFonts w:ascii="Consolas" w:eastAsia="Times New Roman" w:hAnsi="Consolas" w:cs="Times New Roman"/>
           <w:color w:val="E6EDF3"/>
@@ -2208,9 +2233,7 @@
           <w:szCs w:val="21"/>
           <w14:ligatures w14:val="none"/>
         </w:rPr>
-        <w:t>src</w:t>
-      </w:r>
-      <w:proofErr w:type="spellEnd"/>
+      </w:pPr>
       <w:r>
         <w:rPr>
           <w:rFonts w:ascii="Consolas" w:eastAsia="Times New Roman" w:hAnsi="Consolas" w:cs="Times New Roman"/>
@@ -2220,10 +2243,13 @@
           <w:szCs w:val="21"/>
           <w14:ligatures w14:val="none"/>
         </w:rPr>
-        <w:t>/</w:t>
-      </w:r>
-      <w:proofErr w:type="spellStart"/>
-      <w:r>
+        <w:t>  ├─ main.py                      Entry point: CLI parsing, .env loading,</w:t>
+      </w:r>
+    </w:p>
+    <w:p>
+      <w:pPr>
+        <w:shd w:val="clear" w:color="auto" w:fill="0D1117"/>
+        <w:spacing w:after="0" w:line="285" w:lineRule="atLeast"/>
         <w:rPr>
           <w:rFonts w:ascii="Consolas" w:eastAsia="Times New Roman" w:hAnsi="Consolas" w:cs="Times New Roman"/>
           <w:color w:val="E6EDF3"/>
@@ -2232,9 +2258,7 @@
           <w:szCs w:val="21"/>
           <w14:ligatures w14:val="none"/>
         </w:rPr>
-        <w:t>item_ranker</w:t>
-      </w:r>
-      <w:proofErr w:type="spellEnd"/>
+      </w:pPr>
       <w:r>
         <w:rPr>
           <w:rFonts w:ascii="Consolas" w:eastAsia="Times New Roman" w:hAnsi="Consolas" w:cs="Times New Roman"/>
@@ -2244,7 +2268,7 @@
           <w:szCs w:val="21"/>
           <w14:ligatures w14:val="none"/>
         </w:rPr>
-        <w:t>/</w:t>
+        <w:t>  │                                SparkSession, dynamic job module loading</w:t>
       </w:r>
     </w:p>
     <w:p>
@@ -2269,10 +2293,13 @@
           <w:szCs w:val="21"/>
           <w14:ligatures w14:val="none"/>
         </w:rPr>
-        <w:t>  ├─ main.py                      Entry point: CLI parsing</w:t>
-      </w:r>
-      <w:proofErr w:type="gramStart"/>
-      <w:r>
+        <w:t>  ├─ config.py                    Immutable PipelineConfig dataclass</w:t>
+      </w:r>
+    </w:p>
+    <w:p>
+      <w:pPr>
+        <w:shd w:val="clear" w:color="auto" w:fill="0D1117"/>
+        <w:spacing w:after="0" w:line="285" w:lineRule="atLeast"/>
         <w:rPr>
           <w:rFonts w:ascii="Consolas" w:eastAsia="Times New Roman" w:hAnsi="Consolas" w:cs="Times New Roman"/>
           <w:color w:val="E6EDF3"/>
@@ -2281,9 +2308,7 @@
           <w:szCs w:val="21"/>
           <w14:ligatures w14:val="none"/>
         </w:rPr>
-        <w:t>, .env</w:t>
-      </w:r>
-      <w:proofErr w:type="gramEnd"/>
+      </w:pPr>
       <w:r>
         <w:rPr>
           <w:rFonts w:ascii="Consolas" w:eastAsia="Times New Roman" w:hAnsi="Consolas" w:cs="Times New Roman"/>
@@ -2293,7 +2318,7 @@
           <w:szCs w:val="21"/>
           <w14:ligatures w14:val="none"/>
         </w:rPr>
-        <w:t xml:space="preserve"> loading,</w:t>
+        <w:t>  ├─ io/</w:t>
       </w:r>
     </w:p>
     <w:p>
@@ -2318,10 +2343,13 @@
           <w:szCs w:val="21"/>
           <w14:ligatures w14:val="none"/>
         </w:rPr>
-        <w:t>  │                                </w:t>
-      </w:r>
-      <w:proofErr w:type="spellStart"/>
-      <w:r>
+        <w:t>  │   ├─ factory_rdd.py           RDDIOFactory: format-agnostic read/write</w:t>
+      </w:r>
+    </w:p>
+    <w:p>
+      <w:pPr>
+        <w:shd w:val="clear" w:color="auto" w:fill="0D1117"/>
+        <w:spacing w:after="0" w:line="285" w:lineRule="atLeast"/>
         <w:rPr>
           <w:rFonts w:ascii="Consolas" w:eastAsia="Times New Roman" w:hAnsi="Consolas" w:cs="Times New Roman"/>
           <w:color w:val="E6EDF3"/>
@@ -2330,9 +2358,7 @@
           <w:szCs w:val="21"/>
           <w14:ligatures w14:val="none"/>
         </w:rPr>
-        <w:t>SparkSession</w:t>
-      </w:r>
-      <w:proofErr w:type="spellEnd"/>
+      </w:pPr>
       <w:r>
         <w:rPr>
           <w:rFonts w:ascii="Consolas" w:eastAsia="Times New Roman" w:hAnsi="Consolas" w:cs="Times New Roman"/>
@@ -2342,7 +2368,7 @@
           <w:szCs w:val="21"/>
           <w14:ligatures w14:val="none"/>
         </w:rPr>
-        <w:t>, dynamic job module loading</w:t>
+        <w:t>  │   ├─ reader_rdd.py            Concrete readers (Parquet, CSV, JSON, Text)</w:t>
       </w:r>
     </w:p>
     <w:p>
@@ -2367,10 +2393,13 @@
           <w:szCs w:val="21"/>
           <w14:ligatures w14:val="none"/>
         </w:rPr>
-        <w:t xml:space="preserve">  ├─ config.py                    Immutable </w:t>
-      </w:r>
-      <w:proofErr w:type="spellStart"/>
-      <w:r>
+        <w:t>  │   └─ writer_rdd.py            Concrete writers with dated output paths</w:t>
+      </w:r>
+    </w:p>
+    <w:p>
+      <w:pPr>
+        <w:shd w:val="clear" w:color="auto" w:fill="0D1117"/>
+        <w:spacing w:after="0" w:line="285" w:lineRule="atLeast"/>
         <w:rPr>
           <w:rFonts w:ascii="Consolas" w:eastAsia="Times New Roman" w:hAnsi="Consolas" w:cs="Times New Roman"/>
           <w:color w:val="E6EDF3"/>
@@ -2379,9 +2408,7 @@
           <w:szCs w:val="21"/>
           <w14:ligatures w14:val="none"/>
         </w:rPr>
-        <w:t>PipelineConfig</w:t>
-      </w:r>
-      <w:proofErr w:type="spellEnd"/>
+      </w:pPr>
       <w:r>
         <w:rPr>
           <w:rFonts w:ascii="Consolas" w:eastAsia="Times New Roman" w:hAnsi="Consolas" w:cs="Times New Roman"/>
@@ -2391,10 +2418,13 @@
           <w:szCs w:val="21"/>
           <w14:ligatures w14:val="none"/>
         </w:rPr>
-        <w:t xml:space="preserve"> </w:t>
-      </w:r>
-      <w:proofErr w:type="spellStart"/>
-      <w:r>
+        <w:t>  ├─ jobs/</w:t>
+      </w:r>
+    </w:p>
+    <w:p>
+      <w:pPr>
+        <w:shd w:val="clear" w:color="auto" w:fill="0D1117"/>
+        <w:spacing w:after="0" w:line="285" w:lineRule="atLeast"/>
         <w:rPr>
           <w:rFonts w:ascii="Consolas" w:eastAsia="Times New Roman" w:hAnsi="Consolas" w:cs="Times New Roman"/>
           <w:color w:val="E6EDF3"/>
@@ -2403,14 +2433,8 @@
           <w:szCs w:val="21"/>
           <w14:ligatures w14:val="none"/>
         </w:rPr>
-        <w:t>dataclass</w:t>
-      </w:r>
-      <w:proofErr w:type="spellEnd"/>
-    </w:p>
-    <w:p>
-      <w:pPr>
-        <w:shd w:val="clear" w:color="auto" w:fill="0D1117"/>
-        <w:spacing w:after="0" w:line="285" w:lineRule="atLeast"/>
+      </w:pPr>
+      <w:r>
         <w:rPr>
           <w:rFonts w:ascii="Consolas" w:eastAsia="Times New Roman" w:hAnsi="Consolas" w:cs="Times New Roman"/>
           <w:color w:val="E6EDF3"/>
@@ -2419,8 +2443,13 @@
           <w:szCs w:val="21"/>
           <w14:ligatures w14:val="none"/>
         </w:rPr>
-      </w:pPr>
-      <w:r>
+        <w:t>  │   ├─ task1_etl_job.py         Main ETL job: orchestrates full pipeline</w:t>
+      </w:r>
+    </w:p>
+    <w:p>
+      <w:pPr>
+        <w:shd w:val="clear" w:color="auto" w:fill="0D1117"/>
+        <w:spacing w:after="0" w:line="285" w:lineRule="atLeast"/>
         <w:rPr>
           <w:rFonts w:ascii="Consolas" w:eastAsia="Times New Roman" w:hAnsi="Consolas" w:cs="Times New Roman"/>
           <w:color w:val="E6EDF3"/>
@@ -2429,13 +2458,8 @@
           <w:szCs w:val="21"/>
           <w14:ligatures w14:val="none"/>
         </w:rPr>
-        <w:t>  ├─ io/</w:t>
-      </w:r>
-    </w:p>
-    <w:p>
-      <w:pPr>
-        <w:shd w:val="clear" w:color="auto" w:fill="0D1117"/>
-        <w:spacing w:after="0" w:line="285" w:lineRule="atLeast"/>
+      </w:pPr>
+      <w:r>
         <w:rPr>
           <w:rFonts w:ascii="Consolas" w:eastAsia="Times New Roman" w:hAnsi="Consolas" w:cs="Times New Roman"/>
           <w:color w:val="E6EDF3"/>
@@ -2444,8 +2468,13 @@
           <w:szCs w:val="21"/>
           <w14:ligatures w14:val="none"/>
         </w:rPr>
-      </w:pPr>
-      <w:r>
+        <w:t>  │   ├─ schema/</w:t>
+      </w:r>
+    </w:p>
+    <w:p>
+      <w:pPr>
+        <w:shd w:val="clear" w:color="auto" w:fill="0D1117"/>
+        <w:spacing w:after="0" w:line="285" w:lineRule="atLeast"/>
         <w:rPr>
           <w:rFonts w:ascii="Consolas" w:eastAsia="Times New Roman" w:hAnsi="Consolas" w:cs="Times New Roman"/>
           <w:color w:val="E6EDF3"/>
@@ -2454,9 +2483,7 @@
           <w:szCs w:val="21"/>
           <w14:ligatures w14:val="none"/>
         </w:rPr>
-        <w:t xml:space="preserve">  │   ├─ factory_rdd.py           </w:t>
-      </w:r>
-      <w:proofErr w:type="spellStart"/>
+      </w:pPr>
       <w:r>
         <w:rPr>
           <w:rFonts w:ascii="Consolas" w:eastAsia="Times New Roman" w:hAnsi="Consolas" w:cs="Times New Roman"/>
@@ -2466,10 +2493,13 @@
           <w:szCs w:val="21"/>
           <w14:ligatures w14:val="none"/>
         </w:rPr>
-        <w:t>RDDIOFactory</w:t>
-      </w:r>
-      <w:proofErr w:type="spellEnd"/>
-      <w:r>
+        <w:t>  │   │   └─ mapping.py           StructType schemas for input/output datasets</w:t>
+      </w:r>
+    </w:p>
+    <w:p>
+      <w:pPr>
+        <w:shd w:val="clear" w:color="auto" w:fill="0D1117"/>
+        <w:spacing w:after="0" w:line="285" w:lineRule="atLeast"/>
         <w:rPr>
           <w:rFonts w:ascii="Consolas" w:eastAsia="Times New Roman" w:hAnsi="Consolas" w:cs="Times New Roman"/>
           <w:color w:val="E6EDF3"/>
@@ -2478,13 +2508,8 @@
           <w:szCs w:val="21"/>
           <w14:ligatures w14:val="none"/>
         </w:rPr>
-        <w:t>: format-agnostic read/write</w:t>
-      </w:r>
-    </w:p>
-    <w:p>
-      <w:pPr>
-        <w:shd w:val="clear" w:color="auto" w:fill="0D1117"/>
-        <w:spacing w:after="0" w:line="285" w:lineRule="atLeast"/>
+      </w:pPr>
+      <w:r>
         <w:rPr>
           <w:rFonts w:ascii="Consolas" w:eastAsia="Times New Roman" w:hAnsi="Consolas" w:cs="Times New Roman"/>
           <w:color w:val="E6EDF3"/>
@@ -2493,8 +2518,13 @@
           <w:szCs w:val="21"/>
           <w14:ligatures w14:val="none"/>
         </w:rPr>
-      </w:pPr>
-      <w:r>
+        <w:t>  │   └─ transforms/</w:t>
+      </w:r>
+    </w:p>
+    <w:p>
+      <w:pPr>
+        <w:shd w:val="clear" w:color="auto" w:fill="0D1117"/>
+        <w:spacing w:after="0" w:line="285" w:lineRule="atLeast"/>
         <w:rPr>
           <w:rFonts w:ascii="Consolas" w:eastAsia="Times New Roman" w:hAnsi="Consolas" w:cs="Times New Roman"/>
           <w:color w:val="E6EDF3"/>
@@ -2503,13 +2533,8 @@
           <w:szCs w:val="21"/>
           <w14:ligatures w14:val="none"/>
         </w:rPr>
-        <w:t>  │   ├─ reader_rdd.py            Concrete readers (Parquet, CSV, JSON, Text)</w:t>
-      </w:r>
-    </w:p>
-    <w:p>
-      <w:pPr>
-        <w:shd w:val="clear" w:color="auto" w:fill="0D1117"/>
-        <w:spacing w:after="0" w:line="285" w:lineRule="atLeast"/>
+      </w:pPr>
+      <w:r>
         <w:rPr>
           <w:rFonts w:ascii="Consolas" w:eastAsia="Times New Roman" w:hAnsi="Consolas" w:cs="Times New Roman"/>
           <w:color w:val="E6EDF3"/>
@@ -2518,8 +2543,13 @@
           <w:szCs w:val="21"/>
           <w14:ligatures w14:val="none"/>
         </w:rPr>
-      </w:pPr>
-      <w:r>
+        <w:t>  │       ├─ base.py              Abstract RDDTransformation base class</w:t>
+      </w:r>
+    </w:p>
+    <w:p>
+      <w:pPr>
+        <w:shd w:val="clear" w:color="auto" w:fill="0D1117"/>
+        <w:spacing w:after="0" w:line="285" w:lineRule="atLeast"/>
         <w:rPr>
           <w:rFonts w:ascii="Consolas" w:eastAsia="Times New Roman" w:hAnsi="Consolas" w:cs="Times New Roman"/>
           <w:color w:val="E6EDF3"/>
@@ -2528,13 +2558,8 @@
           <w:szCs w:val="21"/>
           <w14:ligatures w14:val="none"/>
         </w:rPr>
-        <w:t>  │   └─ writer_rdd.py            Concrete writers with dated output paths</w:t>
-      </w:r>
-    </w:p>
-    <w:p>
-      <w:pPr>
-        <w:shd w:val="clear" w:color="auto" w:fill="0D1117"/>
-        <w:spacing w:after="0" w:line="285" w:lineRule="atLeast"/>
+      </w:pPr>
+      <w:r>
         <w:rPr>
           <w:rFonts w:ascii="Consolas" w:eastAsia="Times New Roman" w:hAnsi="Consolas" w:cs="Times New Roman"/>
           <w:color w:val="E6EDF3"/>
@@ -2543,7 +2568,8 @@
           <w:szCs w:val="21"/>
           <w14:ligatures w14:val="none"/>
         </w:rPr>
-      </w:pPr>
+        <w:t>  │       ├─ deduplicator.py      </w:t>
+      </w:r>
       <w:r>
         <w:rPr>
           <w:rFonts w:ascii="Consolas" w:eastAsia="Times New Roman" w:hAnsi="Consolas" w:cs="Times New Roman"/>
@@ -2553,13 +2579,9 @@
           <w:szCs w:val="21"/>
           <w14:ligatures w14:val="none"/>
         </w:rPr>
-        <w:t>  ├─ jobs/</w:t>
-      </w:r>
-    </w:p>
-    <w:p>
-      <w:pPr>
-        <w:shd w:val="clear" w:color="auto" w:fill="0D1117"/>
-        <w:spacing w:after="0" w:line="285" w:lineRule="atLeast"/>
+        <w:t xml:space="preserve">Remove </w:t>
+      </w:r>
+      <w:r>
         <w:rPr>
           <w:rFonts w:ascii="Consolas" w:eastAsia="Times New Roman" w:hAnsi="Consolas" w:cs="Times New Roman"/>
           <w:color w:val="E6EDF3"/>
@@ -2568,8 +2590,13 @@
           <w:szCs w:val="21"/>
           <w14:ligatures w14:val="none"/>
         </w:rPr>
-      </w:pPr>
-      <w:r>
+        <w:t>duplicate by detection_oid</w:t>
+      </w:r>
+    </w:p>
+    <w:p>
+      <w:pPr>
+        <w:shd w:val="clear" w:color="auto" w:fill="0D1117"/>
+        <w:spacing w:after="0" w:line="285" w:lineRule="atLeast"/>
         <w:rPr>
           <w:rFonts w:ascii="Consolas" w:eastAsia="Times New Roman" w:hAnsi="Consolas" w:cs="Times New Roman"/>
           <w:color w:val="E6EDF3"/>
@@ -2578,13 +2605,8 @@
           <w:szCs w:val="21"/>
           <w14:ligatures w14:val="none"/>
         </w:rPr>
-        <w:t>  │   ├─ task1_etl_job.py         Main ETL job: orchestrates full pipeline</w:t>
-      </w:r>
-    </w:p>
-    <w:p>
-      <w:pPr>
-        <w:shd w:val="clear" w:color="auto" w:fill="0D1117"/>
-        <w:spacing w:after="0" w:line="285" w:lineRule="atLeast"/>
+      </w:pPr>
+      <w:r>
         <w:rPr>
           <w:rFonts w:ascii="Consolas" w:eastAsia="Times New Roman" w:hAnsi="Consolas" w:cs="Times New Roman"/>
           <w:color w:val="E6EDF3"/>
@@ -2593,8 +2615,13 @@
           <w:szCs w:val="21"/>
           <w14:ligatures w14:val="none"/>
         </w:rPr>
-      </w:pPr>
-      <w:r>
+        <w:t>  │       ├─ aggregator.py        Count items per (location, item) pair</w:t>
+      </w:r>
+    </w:p>
+    <w:p>
+      <w:pPr>
+        <w:shd w:val="clear" w:color="auto" w:fill="0D1117"/>
+        <w:spacing w:after="0" w:line="285" w:lineRule="atLeast"/>
         <w:rPr>
           <w:rFonts w:ascii="Consolas" w:eastAsia="Times New Roman" w:hAnsi="Consolas" w:cs="Times New Roman"/>
           <w:color w:val="E6EDF3"/>
@@ -2603,13 +2630,8 @@
           <w:szCs w:val="21"/>
           <w14:ligatures w14:val="none"/>
         </w:rPr>
-        <w:t>  │   ├─ schema/</w:t>
-      </w:r>
-    </w:p>
-    <w:p>
-      <w:pPr>
-        <w:shd w:val="clear" w:color="auto" w:fill="0D1117"/>
-        <w:spacing w:after="0" w:line="285" w:lineRule="atLeast"/>
+      </w:pPr>
+      <w:r>
         <w:rPr>
           <w:rFonts w:ascii="Consolas" w:eastAsia="Times New Roman" w:hAnsi="Consolas" w:cs="Times New Roman"/>
           <w:color w:val="E6EDF3"/>
@@ -2618,8 +2640,13 @@
           <w:szCs w:val="21"/>
           <w14:ligatures w14:val="none"/>
         </w:rPr>
-      </w:pPr>
-      <w:r>
+        <w:t>  │       ├─ ranking.py           Rank + top-X filter per location</w:t>
+      </w:r>
+    </w:p>
+    <w:p>
+      <w:pPr>
+        <w:shd w:val="clear" w:color="auto" w:fill="0D1117"/>
+        <w:spacing w:after="0" w:line="285" w:lineRule="atLeast"/>
         <w:rPr>
           <w:rFonts w:ascii="Consolas" w:eastAsia="Times New Roman" w:hAnsi="Consolas" w:cs="Times New Roman"/>
           <w:color w:val="E6EDF3"/>
@@ -2628,9 +2655,7 @@
           <w:szCs w:val="21"/>
           <w14:ligatures w14:val="none"/>
         </w:rPr>
-        <w:t xml:space="preserve">  │   │   └─ mapping.py           </w:t>
-      </w:r>
-      <w:proofErr w:type="spellStart"/>
+      </w:pPr>
       <w:r>
         <w:rPr>
           <w:rFonts w:ascii="Consolas" w:eastAsia="Times New Roman" w:hAnsi="Consolas" w:cs="Times New Roman"/>
@@ -2640,10 +2665,13 @@
           <w:szCs w:val="21"/>
           <w14:ligatures w14:val="none"/>
         </w:rPr>
-        <w:t>StructType</w:t>
-      </w:r>
-      <w:proofErr w:type="spellEnd"/>
-      <w:r>
+        <w:t>  │       ├─ enricher.py          Broadcast map-side join with location names</w:t>
+      </w:r>
+    </w:p>
+    <w:p>
+      <w:pPr>
+        <w:shd w:val="clear" w:color="auto" w:fill="0D1117"/>
+        <w:spacing w:after="0" w:line="285" w:lineRule="atLeast"/>
         <w:rPr>
           <w:rFonts w:ascii="Consolas" w:eastAsia="Times New Roman" w:hAnsi="Consolas" w:cs="Times New Roman"/>
           <w:color w:val="E6EDF3"/>
@@ -2652,13 +2680,8 @@
           <w:szCs w:val="21"/>
           <w14:ligatures w14:val="none"/>
         </w:rPr>
-        <w:t xml:space="preserve"> schemas for input/output datasets</w:t>
-      </w:r>
-    </w:p>
-    <w:p>
-      <w:pPr>
-        <w:shd w:val="clear" w:color="auto" w:fill="0D1117"/>
-        <w:spacing w:after="0" w:line="285" w:lineRule="atLeast"/>
+      </w:pPr>
+      <w:r>
         <w:rPr>
           <w:rFonts w:ascii="Consolas" w:eastAsia="Times New Roman" w:hAnsi="Consolas" w:cs="Times New Roman"/>
           <w:color w:val="E6EDF3"/>
@@ -2667,8 +2690,13 @@
           <w:szCs w:val="21"/>
           <w14:ligatures w14:val="none"/>
         </w:rPr>
-      </w:pPr>
-      <w:r>
+        <w:t>  │       └─ pipeline.py          TransformationPipeline orchestrator</w:t>
+      </w:r>
+    </w:p>
+    <w:p>
+      <w:pPr>
+        <w:shd w:val="clear" w:color="auto" w:fill="0D1117"/>
+        <w:spacing w:after="0" w:line="285" w:lineRule="atLeast"/>
         <w:rPr>
           <w:rFonts w:ascii="Consolas" w:eastAsia="Times New Roman" w:hAnsi="Consolas" w:cs="Times New Roman"/>
           <w:color w:val="E6EDF3"/>
@@ -2677,13 +2705,8 @@
           <w:szCs w:val="21"/>
           <w14:ligatures w14:val="none"/>
         </w:rPr>
-        <w:t>  │   └─ transforms/</w:t>
-      </w:r>
-    </w:p>
-    <w:p>
-      <w:pPr>
-        <w:shd w:val="clear" w:color="auto" w:fill="0D1117"/>
-        <w:spacing w:after="0" w:line="285" w:lineRule="atLeast"/>
+      </w:pPr>
+      <w:r>
         <w:rPr>
           <w:rFonts w:ascii="Consolas" w:eastAsia="Times New Roman" w:hAnsi="Consolas" w:cs="Times New Roman"/>
           <w:color w:val="E6EDF3"/>
@@ -2692,8 +2715,13 @@
           <w:szCs w:val="21"/>
           <w14:ligatures w14:val="none"/>
         </w:rPr>
-      </w:pPr>
-      <w:r>
+        <w:t>  └─ util/</w:t>
+      </w:r>
+    </w:p>
+    <w:p>
+      <w:pPr>
+        <w:shd w:val="clear" w:color="auto" w:fill="0D1117"/>
+        <w:spacing w:after="0" w:line="285" w:lineRule="atLeast"/>
         <w:rPr>
           <w:rFonts w:ascii="Consolas" w:eastAsia="Times New Roman" w:hAnsi="Consolas" w:cs="Times New Roman"/>
           <w:color w:val="E6EDF3"/>
@@ -2702,9 +2730,7 @@
           <w:szCs w:val="21"/>
           <w14:ligatures w14:val="none"/>
         </w:rPr>
-        <w:t xml:space="preserve">  │       ├─ base.py              Abstract </w:t>
-      </w:r>
-      <w:proofErr w:type="spellStart"/>
+      </w:pPr>
       <w:r>
         <w:rPr>
           <w:rFonts w:ascii="Consolas" w:eastAsia="Times New Roman" w:hAnsi="Consolas" w:cs="Times New Roman"/>
@@ -2714,278 +2740,8 @@
           <w:szCs w:val="21"/>
           <w14:ligatures w14:val="none"/>
         </w:rPr>
-        <w:t>RDDTransformation</w:t>
-      </w:r>
-      <w:proofErr w:type="spellEnd"/>
-      <w:r>
-        <w:rPr>
-          <w:rFonts w:ascii="Consolas" w:eastAsia="Times New Roman" w:hAnsi="Consolas" w:cs="Times New Roman"/>
-          <w:color w:val="E6EDF3"/>
-          <w:kern w:val="0"/>
-          <w:sz w:val="21"/>
-          <w:szCs w:val="21"/>
-          <w14:ligatures w14:val="none"/>
-        </w:rPr>
-        <w:t xml:space="preserve"> base class</w:t>
-      </w:r>
-    </w:p>
-    <w:p>
-      <w:pPr>
-        <w:shd w:val="clear" w:color="auto" w:fill="0D1117"/>
-        <w:spacing w:after="0" w:line="285" w:lineRule="atLeast"/>
-        <w:rPr>
-          <w:rFonts w:ascii="Consolas" w:eastAsia="Times New Roman" w:hAnsi="Consolas" w:cs="Times New Roman"/>
-          <w:color w:val="E6EDF3"/>
-          <w:kern w:val="0"/>
-          <w:sz w:val="21"/>
-          <w:szCs w:val="21"/>
-          <w14:ligatures w14:val="none"/>
-        </w:rPr>
-      </w:pPr>
-      <w:r>
-        <w:rPr>
-          <w:rFonts w:ascii="Consolas" w:eastAsia="Times New Roman" w:hAnsi="Consolas" w:cs="Times New Roman"/>
-          <w:color w:val="E6EDF3"/>
-          <w:kern w:val="0"/>
-          <w:sz w:val="21"/>
-          <w:szCs w:val="21"/>
-          <w14:ligatures w14:val="none"/>
-        </w:rPr>
-        <w:t>  │       ├─ deduplicator.py      </w:t>
-      </w:r>
-      <w:r>
-        <w:rPr>
-          <w:rFonts w:ascii="Consolas" w:eastAsia="Times New Roman" w:hAnsi="Consolas" w:cs="Times New Roman"/>
-          <w:color w:val="E6EDF3"/>
-          <w:kern w:val="0"/>
-          <w:sz w:val="21"/>
-          <w:szCs w:val="21"/>
-          <w14:ligatures w14:val="none"/>
-        </w:rPr>
-        <w:t xml:space="preserve">Remove </w:t>
-      </w:r>
-      <w:r>
-        <w:rPr>
-          <w:rFonts w:ascii="Consolas" w:eastAsia="Times New Roman" w:hAnsi="Consolas" w:cs="Times New Roman"/>
-          <w:color w:val="E6EDF3"/>
-          <w:kern w:val="0"/>
-          <w:sz w:val="21"/>
-          <w:szCs w:val="21"/>
-          <w14:ligatures w14:val="none"/>
-        </w:rPr>
-        <w:t>duplicate by detection_oid</w:t>
-      </w:r>
-    </w:p>
-    <w:p>
-      <w:pPr>
-        <w:shd w:val="clear" w:color="auto" w:fill="0D1117"/>
-        <w:spacing w:after="0" w:line="285" w:lineRule="atLeast"/>
-        <w:rPr>
-          <w:rFonts w:ascii="Consolas" w:eastAsia="Times New Roman" w:hAnsi="Consolas" w:cs="Times New Roman"/>
-          <w:color w:val="E6EDF3"/>
-          <w:kern w:val="0"/>
-          <w:sz w:val="21"/>
-          <w:szCs w:val="21"/>
-          <w14:ligatures w14:val="none"/>
-        </w:rPr>
-      </w:pPr>
-      <w:r>
-        <w:rPr>
-          <w:rFonts w:ascii="Consolas" w:eastAsia="Times New Roman" w:hAnsi="Consolas" w:cs="Times New Roman"/>
-          <w:color w:val="E6EDF3"/>
-          <w:kern w:val="0"/>
-          <w:sz w:val="21"/>
-          <w:szCs w:val="21"/>
-          <w14:ligatures w14:val="none"/>
-        </w:rPr>
-        <w:t>  │       ├─ aggregator.py        Count items per (location, item) pair</w:t>
-      </w:r>
-    </w:p>
-    <w:p>
-      <w:pPr>
-        <w:shd w:val="clear" w:color="auto" w:fill="0D1117"/>
-        <w:spacing w:after="0" w:line="285" w:lineRule="atLeast"/>
-        <w:rPr>
-          <w:rFonts w:ascii="Consolas" w:eastAsia="Times New Roman" w:hAnsi="Consolas" w:cs="Times New Roman"/>
-          <w:color w:val="E6EDF3"/>
-          <w:kern w:val="0"/>
-          <w:sz w:val="21"/>
-          <w:szCs w:val="21"/>
-          <w14:ligatures w14:val="none"/>
-        </w:rPr>
-      </w:pPr>
-      <w:r>
-        <w:rPr>
-          <w:rFonts w:ascii="Consolas" w:eastAsia="Times New Roman" w:hAnsi="Consolas" w:cs="Times New Roman"/>
-          <w:color w:val="E6EDF3"/>
-          <w:kern w:val="0"/>
-          <w:sz w:val="21"/>
-          <w:szCs w:val="21"/>
-          <w14:ligatures w14:val="none"/>
-        </w:rPr>
-        <w:t>  │       ├─ ranking.py           Rank + top-X filter per location</w:t>
-      </w:r>
-    </w:p>
-    <w:p>
-      <w:pPr>
-        <w:shd w:val="clear" w:color="auto" w:fill="0D1117"/>
-        <w:spacing w:after="0" w:line="285" w:lineRule="atLeast"/>
-        <w:rPr>
-          <w:rFonts w:ascii="Consolas" w:eastAsia="Times New Roman" w:hAnsi="Consolas" w:cs="Times New Roman"/>
-          <w:color w:val="E6EDF3"/>
-          <w:kern w:val="0"/>
-          <w:sz w:val="21"/>
-          <w:szCs w:val="21"/>
-          <w14:ligatures w14:val="none"/>
-        </w:rPr>
-      </w:pPr>
-      <w:r>
-        <w:rPr>
-          <w:rFonts w:ascii="Consolas" w:eastAsia="Times New Roman" w:hAnsi="Consolas" w:cs="Times New Roman"/>
-          <w:color w:val="E6EDF3"/>
-          <w:kern w:val="0"/>
-          <w:sz w:val="21"/>
-          <w:szCs w:val="21"/>
-          <w14:ligatures w14:val="none"/>
-        </w:rPr>
-        <w:t>  │       ├─ enricher.py          Broadcast map-side join with location names</w:t>
-      </w:r>
-    </w:p>
-    <w:p>
-      <w:pPr>
-        <w:shd w:val="clear" w:color="auto" w:fill="0D1117"/>
-        <w:spacing w:after="0" w:line="285" w:lineRule="atLeast"/>
-        <w:rPr>
-          <w:rFonts w:ascii="Consolas" w:eastAsia="Times New Roman" w:hAnsi="Consolas" w:cs="Times New Roman"/>
-          <w:color w:val="E6EDF3"/>
-          <w:kern w:val="0"/>
-          <w:sz w:val="21"/>
-          <w:szCs w:val="21"/>
-          <w14:ligatures w14:val="none"/>
-        </w:rPr>
-      </w:pPr>
-      <w:r>
-        <w:rPr>
-          <w:rFonts w:ascii="Consolas" w:eastAsia="Times New Roman" w:hAnsi="Consolas" w:cs="Times New Roman"/>
-          <w:color w:val="E6EDF3"/>
-          <w:kern w:val="0"/>
-          <w:sz w:val="21"/>
-          <w:szCs w:val="21"/>
-          <w14:ligatures w14:val="none"/>
-        </w:rPr>
-        <w:t>  │       └─ pipeline.py          </w:t>
-      </w:r>
-      <w:proofErr w:type="spellStart"/>
-      <w:r>
-        <w:rPr>
-          <w:rFonts w:ascii="Consolas" w:eastAsia="Times New Roman" w:hAnsi="Consolas" w:cs="Times New Roman"/>
-          <w:color w:val="E6EDF3"/>
-          <w:kern w:val="0"/>
-          <w:sz w:val="21"/>
-          <w:szCs w:val="21"/>
-          <w14:ligatures w14:val="none"/>
-        </w:rPr>
-        <w:t>TransformationPipeline</w:t>
-      </w:r>
-      <w:proofErr w:type="spellEnd"/>
-      <w:r>
-        <w:rPr>
-          <w:rFonts w:ascii="Consolas" w:eastAsia="Times New Roman" w:hAnsi="Consolas" w:cs="Times New Roman"/>
-          <w:color w:val="E6EDF3"/>
-          <w:kern w:val="0"/>
-          <w:sz w:val="21"/>
-          <w:szCs w:val="21"/>
-          <w14:ligatures w14:val="none"/>
-        </w:rPr>
-        <w:t xml:space="preserve"> orchestrator</w:t>
-      </w:r>
-    </w:p>
-    <w:p>
-      <w:pPr>
-        <w:shd w:val="clear" w:color="auto" w:fill="0D1117"/>
-        <w:spacing w:after="0" w:line="285" w:lineRule="atLeast"/>
-        <w:rPr>
-          <w:rFonts w:ascii="Consolas" w:eastAsia="Times New Roman" w:hAnsi="Consolas" w:cs="Times New Roman"/>
-          <w:color w:val="E6EDF3"/>
-          <w:kern w:val="0"/>
-          <w:sz w:val="21"/>
-          <w:szCs w:val="21"/>
-          <w14:ligatures w14:val="none"/>
-        </w:rPr>
-      </w:pPr>
-      <w:r>
-        <w:rPr>
-          <w:rFonts w:ascii="Consolas" w:eastAsia="Times New Roman" w:hAnsi="Consolas" w:cs="Times New Roman"/>
-          <w:color w:val="E6EDF3"/>
-          <w:kern w:val="0"/>
-          <w:sz w:val="21"/>
-          <w:szCs w:val="21"/>
-          <w14:ligatures w14:val="none"/>
-        </w:rPr>
-        <w:t>  └─ util/</w:t>
-      </w:r>
-    </w:p>
-    <w:p>
-      <w:pPr>
-        <w:shd w:val="clear" w:color="auto" w:fill="0D1117"/>
-        <w:spacing w:after="0" w:line="285" w:lineRule="atLeast"/>
-        <w:rPr>
-          <w:rFonts w:ascii="Consolas" w:eastAsia="Times New Roman" w:hAnsi="Consolas" w:cs="Times New Roman"/>
-          <w:color w:val="E6EDF3"/>
-          <w:kern w:val="0"/>
-          <w:sz w:val="21"/>
-          <w:szCs w:val="21"/>
-          <w14:ligatures w14:val="none"/>
-        </w:rPr>
-      </w:pPr>
-      <w:r>
-        <w:rPr>
-          <w:rFonts w:ascii="Consolas" w:eastAsia="Times New Roman" w:hAnsi="Consolas" w:cs="Times New Roman"/>
-          <w:color w:val="E6EDF3"/>
-          <w:kern w:val="0"/>
-          <w:sz w:val="21"/>
-          <w:szCs w:val="21"/>
-          <w14:ligatures w14:val="none"/>
-        </w:rPr>
-        <w:t xml:space="preserve">      ├─ environment.py         </w:t>
-      </w:r>
-      <w:proofErr w:type="gramStart"/>
-      <w:r>
-        <w:rPr>
-          <w:rFonts w:ascii="Consolas" w:eastAsia="Times New Roman" w:hAnsi="Consolas" w:cs="Times New Roman"/>
-          <w:color w:val="E6EDF3"/>
-          <w:kern w:val="0"/>
-          <w:sz w:val="21"/>
-          <w:szCs w:val="21"/>
-          <w14:ligatures w14:val="none"/>
-        </w:rPr>
-        <w:t>  .env</w:t>
-      </w:r>
-      <w:proofErr w:type="gramEnd"/>
-      <w:r>
-        <w:rPr>
-          <w:rFonts w:ascii="Consolas" w:eastAsia="Times New Roman" w:hAnsi="Consolas" w:cs="Times New Roman"/>
-          <w:color w:val="E6EDF3"/>
-          <w:kern w:val="0"/>
-          <w:sz w:val="21"/>
-          <w:szCs w:val="21"/>
-          <w14:ligatures w14:val="none"/>
-        </w:rPr>
-        <w:t xml:space="preserve"> loading via python-</w:t>
-      </w:r>
-      <w:proofErr w:type="spellStart"/>
-      <w:r>
-        <w:rPr>
-          <w:rFonts w:ascii="Consolas" w:eastAsia="Times New Roman" w:hAnsi="Consolas" w:cs="Times New Roman"/>
-          <w:color w:val="E6EDF3"/>
-          <w:kern w:val="0"/>
-          <w:sz w:val="21"/>
-          <w:szCs w:val="21"/>
-          <w14:ligatures w14:val="none"/>
-        </w:rPr>
-        <w:t>dotenv</w:t>
-      </w:r>
-      <w:proofErr w:type="spellEnd"/>
+        <w:t>      ├─ environment.py           .env loading via python-dotenv</w:t>
+      </w:r>
     </w:p>
     <w:p>
       <w:pPr>
@@ -3197,15 +2953,7 @@
     </w:p>
     <w:p>
       <w:r>
-        <w:t xml:space="preserve">The </w:t>
-      </w:r>
-      <w:proofErr w:type="spellStart"/>
-      <w:r>
-        <w:t>depuplication</w:t>
-      </w:r>
-      <w:proofErr w:type="spellEnd"/>
-      <w:r>
-        <w:t xml:space="preserve"> is placed in the first</w:t>
+        <w:t>The depuplication is placed in the first</w:t>
       </w:r>
       <w:r>
         <w:t xml:space="preserve"> stage</w:t>
@@ -3307,182 +3055,73 @@
                 <w:sz w:val="20"/>
                 <w:szCs w:val="20"/>
               </w:rPr>
-              <w:t xml:space="preserve"> </w:t>
-            </w:r>
-            <w:proofErr w:type="spellStart"/>
-            <w:r>
+              <w:t xml:space="preserve"> rdd.map(tuple)</w:t>
+            </w:r>
+          </w:p>
+          <w:p>
+            <w:pPr>
               <w:rPr>
                 <w:sz w:val="20"/>
                 <w:szCs w:val="20"/>
               </w:rPr>
-              <w:t>rdd.map</w:t>
-            </w:r>
-            <w:proofErr w:type="spellEnd"/>
+            </w:pPr>
             <w:r>
               <w:rPr>
                 <w:sz w:val="20"/>
                 <w:szCs w:val="20"/>
               </w:rPr>
-              <w:t>(tuple)</w:t>
-            </w:r>
-          </w:p>
-          <w:p>
-            <w:pPr>
+              <w:t xml:space="preserve">   </w:t>
+            </w:r>
+            <w:r>
               <w:rPr>
                 <w:sz w:val="20"/>
                 <w:szCs w:val="20"/>
               </w:rPr>
-            </w:pPr>
-            <w:r>
+              <w:t>.map(row -&gt; (row[detection_oid_index], row))</w:t>
+            </w:r>
+          </w:p>
+          <w:p>
+            <w:pPr>
               <w:rPr>
                 <w:sz w:val="20"/>
                 <w:szCs w:val="20"/>
               </w:rPr>
-              <w:t xml:space="preserve">   </w:t>
-            </w:r>
-            <w:proofErr w:type="gramStart"/>
+            </w:pPr>
             <w:r>
               <w:rPr>
                 <w:sz w:val="20"/>
                 <w:szCs w:val="20"/>
               </w:rPr>
-              <w:t>.map</w:t>
-            </w:r>
-            <w:proofErr w:type="gramEnd"/>
+              <w:t xml:space="preserve">   </w:t>
+            </w:r>
             <w:r>
               <w:rPr>
                 <w:sz w:val="20"/>
                 <w:szCs w:val="20"/>
               </w:rPr>
-              <w:t>(row -&gt; (row[</w:t>
-            </w:r>
-            <w:proofErr w:type="spellStart"/>
-            <w:r>
+              <w:t>.reduceByKey(lambda a, b: a)</w:t>
+            </w:r>
+          </w:p>
+          <w:p>
+            <w:pPr>
               <w:rPr>
                 <w:sz w:val="20"/>
                 <w:szCs w:val="20"/>
               </w:rPr>
-              <w:t>detection_oid_index</w:t>
-            </w:r>
-            <w:proofErr w:type="spellEnd"/>
+            </w:pPr>
             <w:r>
               <w:rPr>
                 <w:sz w:val="20"/>
                 <w:szCs w:val="20"/>
               </w:rPr>
-              <w:t>], row))</w:t>
-            </w:r>
-          </w:p>
-          <w:p>
-            <w:pPr>
+              <w:t xml:space="preserve">   </w:t>
+            </w:r>
+            <w:r>
               <w:rPr>
                 <w:sz w:val="20"/>
                 <w:szCs w:val="20"/>
               </w:rPr>
-            </w:pPr>
-            <w:r>
-              <w:rPr>
-                <w:sz w:val="20"/>
-                <w:szCs w:val="20"/>
-              </w:rPr>
-              <w:t xml:space="preserve">   </w:t>
-            </w:r>
-            <w:proofErr w:type="gramStart"/>
-            <w:r>
-              <w:rPr>
-                <w:sz w:val="20"/>
-                <w:szCs w:val="20"/>
-              </w:rPr>
-              <w:t>.</w:t>
-            </w:r>
-            <w:proofErr w:type="spellStart"/>
-            <w:r>
-              <w:rPr>
-                <w:sz w:val="20"/>
-                <w:szCs w:val="20"/>
-              </w:rPr>
-              <w:t>reduceByKey</w:t>
-            </w:r>
-            <w:proofErr w:type="spellEnd"/>
-            <w:proofErr w:type="gramEnd"/>
-            <w:r>
-              <w:rPr>
-                <w:sz w:val="20"/>
-                <w:szCs w:val="20"/>
-              </w:rPr>
-              <w:t>(lambda a, b: a)</w:t>
-            </w:r>
-          </w:p>
-          <w:p>
-            <w:pPr>
-              <w:rPr>
-                <w:sz w:val="20"/>
-                <w:szCs w:val="20"/>
-              </w:rPr>
-            </w:pPr>
-            <w:r>
-              <w:rPr>
-                <w:sz w:val="20"/>
-                <w:szCs w:val="20"/>
-              </w:rPr>
-              <w:t xml:space="preserve">   </w:t>
-            </w:r>
-            <w:proofErr w:type="gramStart"/>
-            <w:r>
-              <w:rPr>
-                <w:sz w:val="20"/>
-                <w:szCs w:val="20"/>
-              </w:rPr>
-              <w:t>.map</w:t>
-            </w:r>
-            <w:proofErr w:type="gramEnd"/>
-            <w:r>
-              <w:rPr>
-                <w:sz w:val="20"/>
-                <w:szCs w:val="20"/>
-              </w:rPr>
-              <w:t>(</w:t>
-            </w:r>
-            <w:proofErr w:type="spellStart"/>
-            <w:r>
-              <w:rPr>
-                <w:sz w:val="20"/>
-                <w:szCs w:val="20"/>
-              </w:rPr>
-              <w:t>kv</w:t>
-            </w:r>
-            <w:proofErr w:type="spellEnd"/>
-            <w:r>
-              <w:rPr>
-                <w:sz w:val="20"/>
-                <w:szCs w:val="20"/>
-              </w:rPr>
-              <w:t xml:space="preserve"> -&gt; </w:t>
-            </w:r>
-            <w:proofErr w:type="spellStart"/>
-            <w:proofErr w:type="gramStart"/>
-            <w:r>
-              <w:rPr>
-                <w:sz w:val="20"/>
-                <w:szCs w:val="20"/>
-              </w:rPr>
-              <w:t>kv</w:t>
-            </w:r>
-            <w:proofErr w:type="spellEnd"/>
-            <w:r>
-              <w:rPr>
-                <w:sz w:val="20"/>
-                <w:szCs w:val="20"/>
-              </w:rPr>
-              <w:t>[</w:t>
-            </w:r>
-            <w:proofErr w:type="gramEnd"/>
-            <w:r>
-              <w:rPr>
-                <w:sz w:val="20"/>
-                <w:szCs w:val="20"/>
-              </w:rPr>
-              <w:t>1])</w:t>
+              <w:t>.map(kv -&gt; kv[1])</w:t>
             </w:r>
           </w:p>
           <w:p>
@@ -3515,97 +3154,7 @@
                 <w:sz w:val="20"/>
                 <w:szCs w:val="20"/>
               </w:rPr>
-              <w:t>(</w:t>
-            </w:r>
-            <w:proofErr w:type="spellStart"/>
-            <w:r>
-              <w:rPr>
-                <w:rFonts w:ascii="Times New Roman" w:hAnsi="Times New Roman" w:cs="Times New Roman"/>
-                <w:sz w:val="20"/>
-                <w:szCs w:val="20"/>
-              </w:rPr>
-              <w:t>geographical_location_oid</w:t>
-            </w:r>
-            <w:proofErr w:type="spellEnd"/>
-            <w:r>
-              <w:rPr>
-                <w:rFonts w:ascii="Times New Roman" w:hAnsi="Times New Roman" w:cs="Times New Roman"/>
-                <w:sz w:val="20"/>
-                <w:szCs w:val="20"/>
-              </w:rPr>
-              <w:t xml:space="preserve">, </w:t>
-            </w:r>
-            <w:proofErr w:type="spellStart"/>
-            <w:r>
-              <w:rPr>
-                <w:rFonts w:ascii="Times New Roman" w:hAnsi="Times New Roman" w:cs="Times New Roman"/>
-                <w:sz w:val="20"/>
-                <w:szCs w:val="20"/>
-              </w:rPr>
-              <w:t>video_camera_oid</w:t>
-            </w:r>
-            <w:proofErr w:type="spellEnd"/>
-            <w:r>
-              <w:rPr>
-                <w:rFonts w:ascii="Times New Roman" w:hAnsi="Times New Roman" w:cs="Times New Roman"/>
-                <w:sz w:val="20"/>
-                <w:szCs w:val="20"/>
-              </w:rPr>
-              <w:t xml:space="preserve">, </w:t>
-            </w:r>
-            <w:proofErr w:type="spellStart"/>
-            <w:r>
-              <w:rPr>
-                <w:rFonts w:ascii="Times New Roman" w:hAnsi="Times New Roman" w:cs="Times New Roman"/>
-                <w:sz w:val="20"/>
-                <w:szCs w:val="20"/>
-              </w:rPr>
-              <w:t>detection_oid</w:t>
-            </w:r>
-            <w:proofErr w:type="spellEnd"/>
-            <w:r>
-              <w:rPr>
-                <w:rFonts w:ascii="Times New Roman" w:hAnsi="Times New Roman" w:cs="Times New Roman"/>
-                <w:sz w:val="20"/>
-                <w:szCs w:val="20"/>
-              </w:rPr>
-              <w:t xml:space="preserve">, </w:t>
-            </w:r>
-            <w:proofErr w:type="spellStart"/>
-            <w:r>
-              <w:rPr>
-                <w:rFonts w:ascii="Times New Roman" w:hAnsi="Times New Roman" w:cs="Times New Roman"/>
-                <w:sz w:val="20"/>
-                <w:szCs w:val="20"/>
-              </w:rPr>
-              <w:t>item_name</w:t>
-            </w:r>
-            <w:proofErr w:type="spellEnd"/>
-            <w:r>
-              <w:rPr>
-                <w:rFonts w:ascii="Times New Roman" w:hAnsi="Times New Roman" w:cs="Times New Roman"/>
-                <w:sz w:val="20"/>
-                <w:szCs w:val="20"/>
-              </w:rPr>
-              <w:t xml:space="preserve">, </w:t>
-            </w:r>
-            <w:proofErr w:type="spellStart"/>
-            <w:r>
-              <w:rPr>
-                <w:rFonts w:ascii="Times New Roman" w:hAnsi="Times New Roman" w:cs="Times New Roman"/>
-                <w:sz w:val="20"/>
-                <w:szCs w:val="20"/>
-              </w:rPr>
-              <w:t>timestamp_detected</w:t>
-            </w:r>
-            <w:proofErr w:type="spellEnd"/>
-            <w:r>
-              <w:rPr>
-                <w:rFonts w:ascii="Times New Roman" w:hAnsi="Times New Roman" w:cs="Times New Roman"/>
-                <w:sz w:val="20"/>
-                <w:szCs w:val="20"/>
-              </w:rPr>
-              <w:t>)</w:t>
+              <w:t>(geographical_location_oid, video_camera_oid, detection_oid, item_name, timestamp_detected)</w:t>
             </w:r>
           </w:p>
         </w:tc>
@@ -3622,21 +3171,12 @@
                 <w:szCs w:val="20"/>
               </w:rPr>
             </w:pPr>
-            <w:proofErr w:type="gramStart"/>
             <w:r>
               <w:rPr>
                 <w:sz w:val="20"/>
                 <w:szCs w:val="20"/>
               </w:rPr>
-              <w:t>0(n) time</w:t>
-            </w:r>
-            <w:proofErr w:type="gramEnd"/>
-            <w:r>
-              <w:rPr>
-                <w:sz w:val="20"/>
-                <w:szCs w:val="20"/>
-              </w:rPr>
-              <w:t>, 1 shuffle stage</w:t>
+              <w:t>0(n) time, 1 shuffle stage</w:t>
             </w:r>
           </w:p>
         </w:tc>
@@ -3679,55 +3219,7 @@
           <w:b/>
           <w:bCs/>
         </w:rPr>
-        <w:t xml:space="preserve"> </w:t>
-      </w:r>
-      <w:proofErr w:type="spellStart"/>
-      <w:r>
-        <w:rPr>
-          <w:b/>
-          <w:bCs/>
-        </w:rPr>
-        <w:t>reduceByKey</w:t>
-      </w:r>
-      <w:proofErr w:type="spellEnd"/>
-      <w:r>
-        <w:rPr>
-          <w:b/>
-          <w:bCs/>
-        </w:rPr>
-        <w:t xml:space="preserve"> over </w:t>
-      </w:r>
-      <w:proofErr w:type="spellStart"/>
-      <w:r>
-        <w:rPr>
-          <w:b/>
-          <w:bCs/>
-        </w:rPr>
-        <w:t>groupByKey</w:t>
-      </w:r>
-      <w:proofErr w:type="spellEnd"/>
-      <w:r>
-        <w:rPr>
-          <w:b/>
-          <w:bCs/>
-        </w:rPr>
-        <w:t xml:space="preserve"> or </w:t>
-      </w:r>
-      <w:proofErr w:type="gramStart"/>
-      <w:r>
-        <w:rPr>
-          <w:b/>
-          <w:bCs/>
-        </w:rPr>
-        <w:t>distinct(</w:t>
-      </w:r>
-      <w:proofErr w:type="gramEnd"/>
-      <w:r>
-        <w:rPr>
-          <w:b/>
-          <w:bCs/>
-        </w:rPr>
-        <w:t>)</w:t>
+        <w:t xml:space="preserve"> reduceByKey over groupByKey or distinct()</w:t>
       </w:r>
       <w:r>
         <w:t>:</w:t>
@@ -3741,13 +3233,8 @@
           <w:numId w:val="8"/>
         </w:numPr>
       </w:pPr>
-      <w:proofErr w:type="spellStart"/>
-      <w:r>
-        <w:t>reduceByKey</w:t>
-      </w:r>
-      <w:proofErr w:type="spellEnd"/>
-      <w:r>
-        <w:t xml:space="preserve"> performs map-side combine (local combine) before shuffle, </w:t>
+      <w:r>
+        <w:t xml:space="preserve">reduceByKey performs map-side combine (local combine) before shuffle, </w:t>
       </w:r>
       <w:r>
         <w:t>thereby minimizing the data transferred across network</w:t>
@@ -3785,13 +3272,8 @@
           <w:numId w:val="8"/>
         </w:numPr>
       </w:pPr>
-      <w:proofErr w:type="spellStart"/>
-      <w:r>
-        <w:t>groupBykey</w:t>
-      </w:r>
-      <w:proofErr w:type="spellEnd"/>
-      <w:r>
-        <w:t xml:space="preserve"> would incur more network I/O by building the full list in memory by shuffling all rows which is highly inefficient at this stage of the pipeline. </w:t>
+      <w:r>
+        <w:t xml:space="preserve">groupBykey would incur more network I/O by building the full list in memory by shuffling all rows which is highly inefficient at this stage of the pipeline. </w:t>
       </w:r>
     </w:p>
     <w:p>
@@ -3826,7 +3308,6 @@
         </w:rPr>
         <w:t xml:space="preserve"> (</w:t>
       </w:r>
-      <w:proofErr w:type="spellStart"/>
       <w:r>
         <w:rPr>
           <w:b/>
@@ -3841,16 +3322,7 @@
           <w:bCs/>
           <w:u w:val="single"/>
         </w:rPr>
-        <w:t>orTransform</w:t>
-      </w:r>
-      <w:proofErr w:type="spellEnd"/>
-      <w:r>
-        <w:rPr>
-          <w:b/>
-          <w:bCs/>
-          <w:u w:val="single"/>
-        </w:rPr>
-        <w:t>)</w:t>
+        <w:t>orTransform)</w:t>
       </w:r>
     </w:p>
     <w:p>
@@ -3946,138 +3418,70 @@
                 <w:szCs w:val="20"/>
               </w:rPr>
             </w:pPr>
-            <w:proofErr w:type="spellStart"/>
-            <w:proofErr w:type="gramStart"/>
             <w:r>
               <w:rPr>
                 <w:sz w:val="20"/>
                 <w:szCs w:val="20"/>
               </w:rPr>
-              <w:t>rdd.map</w:t>
-            </w:r>
-            <w:proofErr w:type="spellEnd"/>
-            <w:r>
+              <w:t xml:space="preserve">rdd.map(row -&gt; </w:t>
+            </w:r>
+          </w:p>
+          <w:p>
+            <w:pPr>
               <w:rPr>
                 <w:sz w:val="20"/>
                 <w:szCs w:val="20"/>
               </w:rPr>
-              <w:t>(</w:t>
-            </w:r>
-            <w:proofErr w:type="gramEnd"/>
+            </w:pPr>
             <w:r>
               <w:rPr>
                 <w:sz w:val="20"/>
                 <w:szCs w:val="20"/>
               </w:rPr>
-              <w:t xml:space="preserve">row -&gt; </w:t>
-            </w:r>
-          </w:p>
-          <w:p>
-            <w:pPr>
+              <w:t xml:space="preserve">  </w:t>
+            </w:r>
+            <w:r>
               <w:rPr>
                 <w:sz w:val="20"/>
                 <w:szCs w:val="20"/>
               </w:rPr>
-            </w:pPr>
+              <w:t>((row[geo_oid_index], row[item_name_index]),</w:t>
+            </w:r>
             <w:r>
               <w:rPr>
                 <w:sz w:val="20"/>
                 <w:szCs w:val="20"/>
               </w:rPr>
-              <w:t xml:space="preserve">  </w:t>
+              <w:t xml:space="preserve"> </w:t>
             </w:r>
             <w:r>
               <w:rPr>
                 <w:sz w:val="20"/>
                 <w:szCs w:val="20"/>
               </w:rPr>
-              <w:t>((row[</w:t>
-            </w:r>
-            <w:proofErr w:type="spellStart"/>
-            <w:r>
+              <w:t>1))</w:t>
+            </w:r>
+          </w:p>
+          <w:p>
+            <w:pPr>
               <w:rPr>
                 <w:sz w:val="20"/>
                 <w:szCs w:val="20"/>
               </w:rPr>
-              <w:t>geo_oid_index</w:t>
-            </w:r>
-            <w:proofErr w:type="spellEnd"/>
+            </w:pPr>
             <w:r>
               <w:rPr>
                 <w:sz w:val="20"/>
                 <w:szCs w:val="20"/>
               </w:rPr>
-              <w:t>], row[</w:t>
-            </w:r>
-            <w:proofErr w:type="spellStart"/>
+              <w:t xml:space="preserve">  </w:t>
+            </w:r>
             <w:r>
               <w:rPr>
                 <w:sz w:val="20"/>
                 <w:szCs w:val="20"/>
               </w:rPr>
-              <w:t>item_name_index</w:t>
-            </w:r>
-            <w:proofErr w:type="spellEnd"/>
-            <w:r>
-              <w:rPr>
-                <w:sz w:val="20"/>
-                <w:szCs w:val="20"/>
-              </w:rPr>
-              <w:t>]),</w:t>
-            </w:r>
-            <w:r>
-              <w:rPr>
-                <w:sz w:val="20"/>
-                <w:szCs w:val="20"/>
-              </w:rPr>
-              <w:t xml:space="preserve"> </w:t>
-            </w:r>
-            <w:r>
-              <w:rPr>
-                <w:sz w:val="20"/>
-                <w:szCs w:val="20"/>
-              </w:rPr>
-              <w:t>1))</w:t>
-            </w:r>
-          </w:p>
-          <w:p>
-            <w:pPr>
-              <w:rPr>
-                <w:sz w:val="20"/>
-                <w:szCs w:val="20"/>
-              </w:rPr>
-            </w:pPr>
-            <w:r>
-              <w:rPr>
-                <w:sz w:val="20"/>
-                <w:szCs w:val="20"/>
-              </w:rPr>
-              <w:t xml:space="preserve">  </w:t>
-            </w:r>
-            <w:proofErr w:type="gramStart"/>
-            <w:r>
-              <w:rPr>
-                <w:sz w:val="20"/>
-                <w:szCs w:val="20"/>
-              </w:rPr>
-              <w:t>.</w:t>
-            </w:r>
-            <w:proofErr w:type="spellStart"/>
-            <w:r>
-              <w:rPr>
-                <w:sz w:val="20"/>
-                <w:szCs w:val="20"/>
-              </w:rPr>
-              <w:t>reduceByKey</w:t>
-            </w:r>
-            <w:proofErr w:type="spellEnd"/>
-            <w:proofErr w:type="gramEnd"/>
-            <w:r>
-              <w:rPr>
-                <w:sz w:val="20"/>
-                <w:szCs w:val="20"/>
-              </w:rPr>
-              <w:t>(add)</w:t>
+              <w:t>.reduceByKey(add)</w:t>
             </w:r>
           </w:p>
           <w:p>
@@ -4101,7 +3505,6 @@
                 <w:szCs w:val="20"/>
               </w:rPr>
             </w:pPr>
-            <w:proofErr w:type="gramStart"/>
             <w:r>
               <w:rPr>
                 <w:rFonts w:ascii="Times New Roman" w:hAnsi="Times New Roman" w:cs="Times New Roman"/>
@@ -4124,44 +3527,7 @@
                 <w:sz w:val="20"/>
                 <w:szCs w:val="20"/>
               </w:rPr>
-              <w:t>(</w:t>
-            </w:r>
-            <w:proofErr w:type="spellStart"/>
-            <w:proofErr w:type="gramEnd"/>
-            <w:r>
-              <w:rPr>
-                <w:rFonts w:ascii="Times New Roman" w:hAnsi="Times New Roman" w:cs="Times New Roman"/>
-                <w:sz w:val="20"/>
-                <w:szCs w:val="20"/>
-              </w:rPr>
-              <w:t>geo_oid</w:t>
-            </w:r>
-            <w:proofErr w:type="spellEnd"/>
-            <w:r>
-              <w:rPr>
-                <w:rFonts w:ascii="Times New Roman" w:hAnsi="Times New Roman" w:cs="Times New Roman"/>
-                <w:sz w:val="20"/>
-                <w:szCs w:val="20"/>
-              </w:rPr>
-              <w:t xml:space="preserve">, </w:t>
-            </w:r>
-            <w:proofErr w:type="spellStart"/>
-            <w:r>
-              <w:rPr>
-                <w:rFonts w:ascii="Times New Roman" w:hAnsi="Times New Roman" w:cs="Times New Roman"/>
-                <w:sz w:val="20"/>
-                <w:szCs w:val="20"/>
-              </w:rPr>
-              <w:t>item_name</w:t>
-            </w:r>
-            <w:proofErr w:type="spellEnd"/>
-            <w:r>
-              <w:rPr>
-                <w:rFonts w:ascii="Times New Roman" w:hAnsi="Times New Roman" w:cs="Times New Roman"/>
-                <w:sz w:val="20"/>
-                <w:szCs w:val="20"/>
-              </w:rPr>
-              <w:t>), count)</w:t>
+              <w:t>(geo_oid, item_name), count)</w:t>
             </w:r>
           </w:p>
           <w:p>
@@ -4188,21 +3554,12 @@
                 <w:szCs w:val="20"/>
               </w:rPr>
             </w:pPr>
-            <w:proofErr w:type="gramStart"/>
             <w:r>
               <w:rPr>
                 <w:sz w:val="20"/>
                 <w:szCs w:val="20"/>
               </w:rPr>
-              <w:t>0(n) time</w:t>
-            </w:r>
-            <w:proofErr w:type="gramEnd"/>
-            <w:r>
-              <w:rPr>
-                <w:sz w:val="20"/>
-                <w:szCs w:val="20"/>
-              </w:rPr>
-              <w:t>, 1 shuffle stage</w:t>
+              <w:t>0(n) time, 1 shuffle stage</w:t>
             </w:r>
           </w:p>
         </w:tc>
@@ -4229,17 +3586,8 @@
           <w:b/>
           <w:bCs/>
         </w:rPr>
-        <w:t xml:space="preserve"> </w:t>
-      </w:r>
-      <w:proofErr w:type="spellStart"/>
-      <w:r>
-        <w:rPr>
-          <w:b/>
-          <w:bCs/>
-        </w:rPr>
-        <w:t>reduceByKey</w:t>
-      </w:r>
-      <w:proofErr w:type="spellEnd"/>
+        <w:t xml:space="preserve"> reduceByKey</w:t>
+      </w:r>
     </w:p>
     <w:p>
       <w:pPr>
@@ -4250,23 +3598,7 @@
         </w:numPr>
       </w:pPr>
       <w:r>
-        <w:t xml:space="preserve">Sums are computed per partition (local combine) before shuffle, thus reduce network I/O significantly compared to use </w:t>
-      </w:r>
-      <w:proofErr w:type="spellStart"/>
-      <w:r>
-        <w:t>groupByKey</w:t>
-      </w:r>
-      <w:proofErr w:type="spellEnd"/>
-      <w:r>
-        <w:t xml:space="preserve"> and minimize </w:t>
-      </w:r>
-      <w:proofErr w:type="spellStart"/>
-      <w:r>
-        <w:t>OutOfMemoryError</w:t>
-      </w:r>
-      <w:proofErr w:type="spellEnd"/>
-      <w:r>
-        <w:t xml:space="preserve"> if the key has millions of values (highly skewed)</w:t>
+        <w:t>Sums are computed per partition (local combine) before shuffle, thus reduce network I/O significantly compared to use groupByKey and minimize OutOfMemoryError if the key has millions of values (highly skewed)</w:t>
       </w:r>
     </w:p>
     <w:p>
@@ -4329,7 +3661,6 @@
         </w:rPr>
         <w:t xml:space="preserve"> (</w:t>
       </w:r>
-      <w:proofErr w:type="spellStart"/>
       <w:r>
         <w:rPr>
           <w:b/>
@@ -4344,16 +3675,7 @@
           <w:bCs/>
           <w:u w:val="single"/>
         </w:rPr>
-        <w:t>Transform</w:t>
-      </w:r>
-      <w:proofErr w:type="spellEnd"/>
-      <w:r>
-        <w:rPr>
-          <w:b/>
-          <w:bCs/>
-          <w:u w:val="single"/>
-        </w:rPr>
-        <w:t>)</w:t>
+        <w:t>Transform)</w:t>
       </w:r>
     </w:p>
     <w:p>
@@ -4449,39 +3771,34 @@
                 <w:szCs w:val="20"/>
               </w:rPr>
             </w:pPr>
-            <w:proofErr w:type="spellStart"/>
-            <w:proofErr w:type="gramStart"/>
             <w:r>
               <w:rPr>
                 <w:sz w:val="20"/>
                 <w:szCs w:val="20"/>
               </w:rPr>
-              <w:t>rdd.map</w:t>
-            </w:r>
-            <w:proofErr w:type="spellEnd"/>
-            <w:r>
+              <w:t xml:space="preserve">rdd.map(kv -&gt; </w:t>
+            </w:r>
+          </w:p>
+          <w:p>
+            <w:pPr>
               <w:rPr>
                 <w:sz w:val="20"/>
                 <w:szCs w:val="20"/>
               </w:rPr>
-              <w:t>(</w:t>
-            </w:r>
-            <w:proofErr w:type="spellStart"/>
-            <w:proofErr w:type="gramEnd"/>
+            </w:pPr>
             <w:r>
               <w:rPr>
                 <w:sz w:val="20"/>
                 <w:szCs w:val="20"/>
               </w:rPr>
-              <w:t>kv</w:t>
-            </w:r>
-            <w:proofErr w:type="spellEnd"/>
+              <w:t xml:space="preserve">  </w:t>
+            </w:r>
             <w:r>
               <w:rPr>
                 <w:sz w:val="20"/>
                 <w:szCs w:val="20"/>
               </w:rPr>
-              <w:t xml:space="preserve"> -&gt; </w:t>
+              <w:t>(geo_oid, (item_name, count)))</w:t>
             </w:r>
           </w:p>
           <w:p>
@@ -4496,255 +3813,94 @@
                 <w:sz w:val="20"/>
                 <w:szCs w:val="20"/>
               </w:rPr>
-              <w:t xml:space="preserve">  </w:t>
-            </w:r>
-            <w:r>
+              <w:t>   .groupByKey()</w:t>
+            </w:r>
+          </w:p>
+          <w:p>
+            <w:pPr>
               <w:rPr>
                 <w:sz w:val="20"/>
                 <w:szCs w:val="20"/>
               </w:rPr>
-              <w:t>(</w:t>
-            </w:r>
-            <w:proofErr w:type="spellStart"/>
+            </w:pPr>
             <w:r>
               <w:rPr>
                 <w:sz w:val="20"/>
                 <w:szCs w:val="20"/>
               </w:rPr>
-              <w:t>geo_oid</w:t>
-            </w:r>
-            <w:proofErr w:type="spellEnd"/>
+              <w:t>   .flatMap(_rank_items: sort desc by count</w:t>
+            </w:r>
             <w:r>
               <w:rPr>
                 <w:sz w:val="20"/>
                 <w:szCs w:val="20"/>
               </w:rPr>
-              <w:t>, (</w:t>
-            </w:r>
-            <w:proofErr w:type="spellStart"/>
+              <w:t xml:space="preserve"> desc</w:t>
+            </w:r>
             <w:r>
               <w:rPr>
                 <w:sz w:val="20"/>
                 <w:szCs w:val="20"/>
               </w:rPr>
-              <w:t>item_name</w:t>
-            </w:r>
-            <w:proofErr w:type="spellEnd"/>
-            <w:r>
+              <w:t xml:space="preserve">, </w:t>
+            </w:r>
+          </w:p>
+          <w:p>
+            <w:pPr>
               <w:rPr>
                 <w:sz w:val="20"/>
                 <w:szCs w:val="20"/>
               </w:rPr>
-              <w:t>, count)))</w:t>
-            </w:r>
-          </w:p>
-          <w:p>
-            <w:pPr>
+            </w:pPr>
+            <w:r>
               <w:rPr>
                 <w:sz w:val="20"/>
                 <w:szCs w:val="20"/>
               </w:rPr>
-            </w:pPr>
+              <w:t xml:space="preserve">                      Item name asc</w:t>
+            </w:r>
             <w:r>
               <w:rPr>
                 <w:sz w:val="20"/>
                 <w:szCs w:val="20"/>
               </w:rPr>
-              <w:t>   </w:t>
-            </w:r>
-            <w:proofErr w:type="gramStart"/>
+              <w:t>,</w:t>
+            </w:r>
             <w:r>
               <w:rPr>
                 <w:sz w:val="20"/>
                 <w:szCs w:val="20"/>
               </w:rPr>
-              <w:t>.</w:t>
-            </w:r>
-            <w:proofErr w:type="spellStart"/>
+              <w:t xml:space="preserve"> </w:t>
+            </w:r>
             <w:r>
               <w:rPr>
                 <w:sz w:val="20"/>
                 <w:szCs w:val="20"/>
               </w:rPr>
-              <w:t>groupByKey</w:t>
-            </w:r>
-            <w:proofErr w:type="spellEnd"/>
-            <w:proofErr w:type="gramEnd"/>
-            <w:r>
+              <w:t xml:space="preserve">take top_x, assign </w:t>
+            </w:r>
+          </w:p>
+          <w:p>
+            <w:pPr>
               <w:rPr>
                 <w:sz w:val="20"/>
                 <w:szCs w:val="20"/>
               </w:rPr>
-              <w:t>()</w:t>
-            </w:r>
-          </w:p>
-          <w:p>
-            <w:pPr>
+            </w:pPr>
+            <w:r>
               <w:rPr>
                 <w:sz w:val="20"/>
                 <w:szCs w:val="20"/>
               </w:rPr>
-            </w:pPr>
+              <w:t xml:space="preserve">                      </w:t>
+            </w:r>
             <w:r>
               <w:rPr>
                 <w:sz w:val="20"/>
                 <w:szCs w:val="20"/>
               </w:rPr>
-              <w:t>   </w:t>
-            </w:r>
-            <w:proofErr w:type="gramStart"/>
-            <w:r>
-              <w:rPr>
-                <w:sz w:val="20"/>
-                <w:szCs w:val="20"/>
-              </w:rPr>
-              <w:t>.</w:t>
-            </w:r>
-            <w:proofErr w:type="spellStart"/>
-            <w:r>
-              <w:rPr>
-                <w:sz w:val="20"/>
-                <w:szCs w:val="20"/>
-              </w:rPr>
-              <w:t>flatMap</w:t>
-            </w:r>
-            <w:proofErr w:type="spellEnd"/>
-            <w:proofErr w:type="gramEnd"/>
-            <w:r>
-              <w:rPr>
-                <w:sz w:val="20"/>
-                <w:szCs w:val="20"/>
-              </w:rPr>
-              <w:t>(_</w:t>
-            </w:r>
-            <w:proofErr w:type="spellStart"/>
-            <w:r>
-              <w:rPr>
-                <w:sz w:val="20"/>
-                <w:szCs w:val="20"/>
-              </w:rPr>
-              <w:t>rank_items</w:t>
-            </w:r>
-            <w:proofErr w:type="spellEnd"/>
-            <w:r>
-              <w:rPr>
-                <w:sz w:val="20"/>
-                <w:szCs w:val="20"/>
-              </w:rPr>
-              <w:t>: sort desc by count</w:t>
-            </w:r>
-            <w:r>
-              <w:rPr>
-                <w:sz w:val="20"/>
-                <w:szCs w:val="20"/>
-              </w:rPr>
-              <w:t xml:space="preserve"> desc</w:t>
-            </w:r>
-            <w:r>
-              <w:rPr>
-                <w:sz w:val="20"/>
-                <w:szCs w:val="20"/>
-              </w:rPr>
-              <w:t xml:space="preserve">, </w:t>
-            </w:r>
-          </w:p>
-          <w:p>
-            <w:pPr>
-              <w:rPr>
-                <w:sz w:val="20"/>
-                <w:szCs w:val="20"/>
-              </w:rPr>
-            </w:pPr>
-            <w:r>
-              <w:rPr>
-                <w:sz w:val="20"/>
-                <w:szCs w:val="20"/>
-              </w:rPr>
-              <w:t xml:space="preserve">                      Item name </w:t>
-            </w:r>
-            <w:proofErr w:type="spellStart"/>
-            <w:r>
-              <w:rPr>
-                <w:sz w:val="20"/>
-                <w:szCs w:val="20"/>
-              </w:rPr>
-              <w:t>asc</w:t>
-            </w:r>
-            <w:proofErr w:type="spellEnd"/>
-            <w:r>
-              <w:rPr>
-                <w:sz w:val="20"/>
-                <w:szCs w:val="20"/>
-              </w:rPr>
-              <w:t>,</w:t>
-            </w:r>
-            <w:r>
-              <w:rPr>
-                <w:sz w:val="20"/>
-                <w:szCs w:val="20"/>
-              </w:rPr>
-              <w:t xml:space="preserve"> </w:t>
-            </w:r>
-            <w:r>
-              <w:rPr>
-                <w:sz w:val="20"/>
-                <w:szCs w:val="20"/>
-              </w:rPr>
-              <w:t xml:space="preserve">take </w:t>
-            </w:r>
-            <w:proofErr w:type="spellStart"/>
-            <w:r>
-              <w:rPr>
-                <w:sz w:val="20"/>
-                <w:szCs w:val="20"/>
-              </w:rPr>
-              <w:t>top_x</w:t>
-            </w:r>
-            <w:proofErr w:type="spellEnd"/>
-            <w:r>
-              <w:rPr>
-                <w:sz w:val="20"/>
-                <w:szCs w:val="20"/>
-              </w:rPr>
-              <w:t xml:space="preserve">, assign </w:t>
-            </w:r>
-          </w:p>
-          <w:p>
-            <w:pPr>
-              <w:rPr>
-                <w:sz w:val="20"/>
-                <w:szCs w:val="20"/>
-              </w:rPr>
-            </w:pPr>
-            <w:r>
-              <w:rPr>
-                <w:sz w:val="20"/>
-                <w:szCs w:val="20"/>
-              </w:rPr>
-              <w:t xml:space="preserve">                      </w:t>
-            </w:r>
-            <w:r>
-              <w:rPr>
-                <w:sz w:val="20"/>
-                <w:szCs w:val="20"/>
-              </w:rPr>
-              <w:t xml:space="preserve">rank </w:t>
-            </w:r>
-            <w:proofErr w:type="gramStart"/>
-            <w:r>
-              <w:rPr>
-                <w:sz w:val="20"/>
-                <w:szCs w:val="20"/>
-              </w:rPr>
-              <w:t>1..</w:t>
-            </w:r>
-            <w:proofErr w:type="gramEnd"/>
-            <w:r>
-              <w:rPr>
-                <w:sz w:val="20"/>
-                <w:szCs w:val="20"/>
-              </w:rPr>
-              <w:t>top_x via enumerate)</w:t>
+              <w:t>rank 1..top_x via enumerate)</w:t>
             </w:r>
           </w:p>
           <w:p>
@@ -4774,43 +3930,7 @@
                 <w:sz w:val="20"/>
                 <w:szCs w:val="20"/>
               </w:rPr>
-              <w:t>(</w:t>
-            </w:r>
-            <w:proofErr w:type="spellStart"/>
-            <w:r>
-              <w:rPr>
-                <w:rFonts w:ascii="Times New Roman" w:hAnsi="Times New Roman" w:cs="Times New Roman"/>
-                <w:sz w:val="20"/>
-                <w:szCs w:val="20"/>
-              </w:rPr>
-              <w:t>geo_oid</w:t>
-            </w:r>
-            <w:proofErr w:type="spellEnd"/>
-            <w:r>
-              <w:rPr>
-                <w:rFonts w:ascii="Times New Roman" w:hAnsi="Times New Roman" w:cs="Times New Roman"/>
-                <w:sz w:val="20"/>
-                <w:szCs w:val="20"/>
-              </w:rPr>
-              <w:t xml:space="preserve">, rank, </w:t>
-            </w:r>
-            <w:proofErr w:type="spellStart"/>
-            <w:r>
-              <w:rPr>
-                <w:rFonts w:ascii="Times New Roman" w:hAnsi="Times New Roman" w:cs="Times New Roman"/>
-                <w:sz w:val="20"/>
-                <w:szCs w:val="20"/>
-              </w:rPr>
-              <w:t>item_name</w:t>
-            </w:r>
-            <w:proofErr w:type="spellEnd"/>
-            <w:r>
-              <w:rPr>
-                <w:rFonts w:ascii="Times New Roman" w:hAnsi="Times New Roman" w:cs="Times New Roman"/>
-                <w:sz w:val="20"/>
-                <w:szCs w:val="20"/>
-              </w:rPr>
-              <w:t>)</w:t>
+              <w:t>(geo_oid, rank, item_name)</w:t>
             </w:r>
           </w:p>
           <w:p>
@@ -4854,23 +3974,7 @@
                 <w:sz w:val="20"/>
                 <w:szCs w:val="20"/>
               </w:rPr>
-              <w:t xml:space="preserve">stage. Per-group sorting is </w:t>
-            </w:r>
-            <w:proofErr w:type="gramStart"/>
-            <w:r>
-              <w:rPr>
-                <w:sz w:val="20"/>
-                <w:szCs w:val="20"/>
-              </w:rPr>
-              <w:t>O(</w:t>
-            </w:r>
-            <w:proofErr w:type="gramEnd"/>
-            <w:r>
-              <w:rPr>
-                <w:sz w:val="20"/>
-                <w:szCs w:val="20"/>
-              </w:rPr>
-              <w:t>k log k) per location.</w:t>
+              <w:t>stage. Per-group sorting is O(k log k) per location.</w:t>
             </w:r>
           </w:p>
           <w:p>
@@ -4906,7 +4010,6 @@
         </w:rPr>
         <w:t xml:space="preserve"> </w:t>
       </w:r>
-      <w:proofErr w:type="spellStart"/>
       <w:r>
         <w:rPr>
           <w:b/>
@@ -4921,7 +4024,6 @@
         </w:rPr>
         <w:t>ByKey</w:t>
       </w:r>
-      <w:proofErr w:type="spellEnd"/>
     </w:p>
     <w:p>
       <w:pPr>
@@ -4950,23 +4052,7 @@
         </w:numPr>
       </w:pPr>
       <w:r>
-        <w:t xml:space="preserve">Sorting </w:t>
-      </w:r>
-      <w:proofErr w:type="gramStart"/>
-      <w:r>
-        <w:t>need</w:t>
-      </w:r>
-      <w:proofErr w:type="gramEnd"/>
-      <w:r>
-        <w:t xml:space="preserve"> to occur over complete set of items to assign the ranking, thus </w:t>
-      </w:r>
-      <w:proofErr w:type="spellStart"/>
-      <w:r>
-        <w:t>groupByKey</w:t>
-      </w:r>
-      <w:proofErr w:type="spellEnd"/>
-      <w:r>
-        <w:t xml:space="preserve"> is necessary here.</w:t>
+        <w:t>Sorting need to occur over complete set of items to assign the ranking, thus groupByKey is necessary here.</w:t>
       </w:r>
     </w:p>
     <w:p>
@@ -5029,7 +4115,6 @@
         </w:rPr>
         <w:t xml:space="preserve"> (</w:t>
       </w:r>
-      <w:proofErr w:type="spellStart"/>
       <w:r>
         <w:rPr>
           <w:b/>
@@ -5044,16 +4129,7 @@
           <w:bCs/>
           <w:u w:val="single"/>
         </w:rPr>
-        <w:t>Transform</w:t>
-      </w:r>
-      <w:proofErr w:type="spellEnd"/>
-      <w:r>
-        <w:rPr>
-          <w:b/>
-          <w:bCs/>
-          <w:u w:val="single"/>
-        </w:rPr>
-        <w:t>)</w:t>
+        <w:t>Transform)</w:t>
       </w:r>
     </w:p>
     <w:p>
@@ -5149,135 +4225,42 @@
                 <w:szCs w:val="20"/>
               </w:rPr>
             </w:pPr>
-            <w:proofErr w:type="spellStart"/>
             <w:r>
               <w:rPr>
                 <w:sz w:val="20"/>
                 <w:szCs w:val="20"/>
               </w:rPr>
-              <w:t>broadcast_dict</w:t>
-            </w:r>
-            <w:proofErr w:type="spellEnd"/>
-            <w:r>
+              <w:t>broadcast_dict = sc.broadcast(locations_dict)</w:t>
+            </w:r>
+          </w:p>
+          <w:p>
+            <w:pPr>
               <w:rPr>
                 <w:sz w:val="20"/>
                 <w:szCs w:val="20"/>
               </w:rPr>
-              <w:t xml:space="preserve"> = </w:t>
-            </w:r>
-            <w:proofErr w:type="spellStart"/>
-            <w:proofErr w:type="gramStart"/>
+            </w:pPr>
             <w:r>
               <w:rPr>
                 <w:sz w:val="20"/>
                 <w:szCs w:val="20"/>
               </w:rPr>
-              <w:t>sc.broadcast</w:t>
-            </w:r>
-            <w:proofErr w:type="spellEnd"/>
-            <w:proofErr w:type="gramEnd"/>
-            <w:r>
+              <w:t> </w:t>
+            </w:r>
+          </w:p>
+          <w:p>
+            <w:pPr>
               <w:rPr>
                 <w:sz w:val="20"/>
                 <w:szCs w:val="20"/>
               </w:rPr>
-              <w:t>(</w:t>
-            </w:r>
-            <w:proofErr w:type="spellStart"/>
+            </w:pPr>
             <w:r>
               <w:rPr>
                 <w:sz w:val="20"/>
                 <w:szCs w:val="20"/>
               </w:rPr>
-              <w:t>locations_dict</w:t>
-            </w:r>
-            <w:proofErr w:type="spellEnd"/>
-            <w:r>
-              <w:rPr>
-                <w:sz w:val="20"/>
-                <w:szCs w:val="20"/>
-              </w:rPr>
-              <w:t>)</w:t>
-            </w:r>
-          </w:p>
-          <w:p>
-            <w:pPr>
-              <w:rPr>
-                <w:sz w:val="20"/>
-                <w:szCs w:val="20"/>
-              </w:rPr>
-            </w:pPr>
-            <w:r>
-              <w:rPr>
-                <w:sz w:val="20"/>
-                <w:szCs w:val="20"/>
-              </w:rPr>
-              <w:t> </w:t>
-            </w:r>
-          </w:p>
-          <w:p>
-            <w:pPr>
-              <w:rPr>
-                <w:sz w:val="20"/>
-                <w:szCs w:val="20"/>
-              </w:rPr>
-            </w:pPr>
-            <w:proofErr w:type="spellStart"/>
-            <w:proofErr w:type="gramStart"/>
-            <w:r>
-              <w:rPr>
-                <w:sz w:val="20"/>
-                <w:szCs w:val="20"/>
-              </w:rPr>
-              <w:t>rdd.map</w:t>
-            </w:r>
-            <w:proofErr w:type="spellEnd"/>
-            <w:r>
-              <w:rPr>
-                <w:sz w:val="20"/>
-                <w:szCs w:val="20"/>
-              </w:rPr>
-              <w:t>(</w:t>
-            </w:r>
-            <w:proofErr w:type="gramEnd"/>
-            <w:r>
-              <w:rPr>
-                <w:sz w:val="20"/>
-                <w:szCs w:val="20"/>
-              </w:rPr>
-              <w:t xml:space="preserve">row -&gt; insert </w:t>
-            </w:r>
-            <w:proofErr w:type="spellStart"/>
-            <w:r>
-              <w:rPr>
-                <w:sz w:val="20"/>
-                <w:szCs w:val="20"/>
-              </w:rPr>
-              <w:t>location_name</w:t>
-            </w:r>
-            <w:proofErr w:type="spellEnd"/>
-            <w:r>
-              <w:rPr>
-                <w:sz w:val="20"/>
-                <w:szCs w:val="20"/>
-              </w:rPr>
-              <w:t xml:space="preserve"> at </w:t>
-            </w:r>
-            <w:proofErr w:type="spellStart"/>
-            <w:r>
-              <w:rPr>
-                <w:sz w:val="20"/>
-                <w:szCs w:val="20"/>
-              </w:rPr>
-              <w:t>insert_pos</w:t>
-            </w:r>
-            <w:proofErr w:type="spellEnd"/>
-            <w:r>
-              <w:rPr>
-                <w:sz w:val="20"/>
-                <w:szCs w:val="20"/>
-              </w:rPr>
-              <w:t xml:space="preserve"> </w:t>
+              <w:t xml:space="preserve">rdd.map(row -&gt; insert location_name at insert_pos </w:t>
             </w:r>
           </w:p>
           <w:p>
@@ -5329,61 +4312,7 @@
                 <w:sz w:val="20"/>
                 <w:szCs w:val="20"/>
               </w:rPr>
-              <w:t> (</w:t>
-            </w:r>
-            <w:proofErr w:type="spellStart"/>
-            <w:r>
-              <w:rPr>
-                <w:rFonts w:ascii="Times New Roman" w:hAnsi="Times New Roman" w:cs="Times New Roman"/>
-                <w:sz w:val="20"/>
-                <w:szCs w:val="20"/>
-              </w:rPr>
-              <w:t>geo_oid</w:t>
-            </w:r>
-            <w:proofErr w:type="spellEnd"/>
-            <w:r>
-              <w:rPr>
-                <w:rFonts w:ascii="Times New Roman" w:hAnsi="Times New Roman" w:cs="Times New Roman"/>
-                <w:sz w:val="20"/>
-                <w:szCs w:val="20"/>
-              </w:rPr>
-              <w:t xml:space="preserve">, </w:t>
-            </w:r>
-            <w:proofErr w:type="spellStart"/>
-            <w:r>
-              <w:rPr>
-                <w:rFonts w:ascii="Times New Roman" w:hAnsi="Times New Roman" w:cs="Times New Roman"/>
-                <w:sz w:val="20"/>
-                <w:szCs w:val="20"/>
-              </w:rPr>
-              <w:t>geo_location</w:t>
-            </w:r>
-            <w:proofErr w:type="spellEnd"/>
-            <w:r>
-              <w:rPr>
-                <w:rFonts w:ascii="Times New Roman" w:hAnsi="Times New Roman" w:cs="Times New Roman"/>
-                <w:sz w:val="20"/>
-                <w:szCs w:val="20"/>
-              </w:rPr>
-              <w:t xml:space="preserve">, rank, </w:t>
-            </w:r>
-            <w:proofErr w:type="spellStart"/>
-            <w:r>
-              <w:rPr>
-                <w:rFonts w:ascii="Times New Roman" w:hAnsi="Times New Roman" w:cs="Times New Roman"/>
-                <w:sz w:val="20"/>
-                <w:szCs w:val="20"/>
-              </w:rPr>
-              <w:t>item_name</w:t>
-            </w:r>
-            <w:proofErr w:type="spellEnd"/>
-            <w:r>
-              <w:rPr>
-                <w:rFonts w:ascii="Times New Roman" w:hAnsi="Times New Roman" w:cs="Times New Roman"/>
-                <w:sz w:val="20"/>
-                <w:szCs w:val="20"/>
-              </w:rPr>
-              <w:t>)</w:t>
+              <w:t> (geo_oid, geo_location, rank, item_name)</w:t>
             </w:r>
           </w:p>
           <w:p>
@@ -5473,17 +4402,8 @@
           <w:b/>
           <w:bCs/>
         </w:rPr>
-        <w:t xml:space="preserve">Broadcast join instead of </w:t>
-      </w:r>
-      <w:proofErr w:type="spellStart"/>
-      <w:r>
-        <w:rPr>
-          <w:b/>
-          <w:bCs/>
-        </w:rPr>
-        <w:t>RDD.join</w:t>
-      </w:r>
-      <w:proofErr w:type="spellEnd"/>
+        <w:t>Broadcast join instead of RDD.join</w:t>
+      </w:r>
     </w:p>
     <w:p>
       <w:pPr>
@@ -5558,11 +4478,9 @@
       <w:r>
         <w:t xml:space="preserve"> Pattern (</w:t>
       </w:r>
-      <w:proofErr w:type="spellStart"/>
       <w:r>
         <w:t>RDDIOFactory</w:t>
       </w:r>
-      <w:proofErr w:type="spellEnd"/>
       <w:r>
         <w:t>)</w:t>
       </w:r>
@@ -5603,15 +4521,7 @@
         <w:t xml:space="preserve"> </w:t>
       </w:r>
       <w:r>
-        <w:t xml:space="preserve">Pattern (via </w:t>
-      </w:r>
-      <w:proofErr w:type="spellStart"/>
-      <w:r>
-        <w:t>RDDTransformation</w:t>
-      </w:r>
-      <w:proofErr w:type="spellEnd"/>
-      <w:r>
-        <w:t xml:space="preserve"> base class)</w:t>
+        <w:t>Pattern (via RDDTransformation base class)</w:t>
       </w:r>
       <w:bookmarkEnd w:id="9"/>
     </w:p>
@@ -5649,21 +4559,7 @@
         <w:rPr>
           <w:rFonts w:ascii="Times New Roman" w:hAnsi="Times New Roman" w:cs="Times New Roman"/>
         </w:rPr>
-        <w:t>the execute(</w:t>
-      </w:r>
-      <w:proofErr w:type="spellStart"/>
-      <w:r>
-        <w:rPr>
-          <w:rFonts w:ascii="Times New Roman" w:hAnsi="Times New Roman" w:cs="Times New Roman"/>
-        </w:rPr>
-        <w:t>rdd</w:t>
-      </w:r>
-      <w:proofErr w:type="spellEnd"/>
-      <w:r>
-        <w:rPr>
-          <w:rFonts w:ascii="Times New Roman" w:hAnsi="Times New Roman" w:cs="Times New Roman"/>
-        </w:rPr>
-        <w:t xml:space="preserve">) </w:t>
+        <w:t xml:space="preserve">the execute(rdd) </w:t>
       </w:r>
       <w:r>
         <w:rPr>
@@ -5773,11 +4669,9 @@
       <w:r>
         <w:t>Pattern (</w:t>
       </w:r>
-      <w:proofErr w:type="spellStart"/>
       <w:r>
         <w:t>TransformationPipeline</w:t>
       </w:r>
-      <w:proofErr w:type="spellEnd"/>
       <w:r>
         <w:t>)</w:t>
       </w:r>
@@ -5793,21 +4687,7 @@
         <w:rPr>
           <w:rFonts w:ascii="Times New Roman" w:hAnsi="Times New Roman" w:cs="Times New Roman"/>
         </w:rPr>
-        <w:t xml:space="preserve">The pipeline orchestrator accepts a list of </w:t>
-      </w:r>
-      <w:proofErr w:type="spellStart"/>
-      <w:r>
-        <w:rPr>
-          <w:rFonts w:ascii="Times New Roman" w:hAnsi="Times New Roman" w:cs="Times New Roman"/>
-        </w:rPr>
-        <w:t>RDDTransformation</w:t>
-      </w:r>
-      <w:proofErr w:type="spellEnd"/>
-      <w:r>
-        <w:rPr>
-          <w:rFonts w:ascii="Times New Roman" w:hAnsi="Times New Roman" w:cs="Times New Roman"/>
-        </w:rPr>
-        <w:t xml:space="preserve"> objects and applies them sequentially. This helps to:</w:t>
+        <w:t>The pipeline orchestrator accepts a list of RDDTransformation objects and applies them sequentially. This helps to:</w:t>
       </w:r>
     </w:p>
     <w:p>
@@ -5825,21 +4705,7 @@
         <w:rPr>
           <w:rFonts w:ascii="Times New Roman" w:hAnsi="Times New Roman" w:cs="Times New Roman"/>
         </w:rPr>
-        <w:t xml:space="preserve">Adding/removing/reordering stages requires only changing the list passed to </w:t>
-      </w:r>
-      <w:proofErr w:type="spellStart"/>
-      <w:r>
-        <w:rPr>
-          <w:rFonts w:ascii="Times New Roman" w:hAnsi="Times New Roman" w:cs="Times New Roman"/>
-        </w:rPr>
-        <w:t>TransformationPipeline</w:t>
-      </w:r>
-      <w:proofErr w:type="spellEnd"/>
-      <w:r>
-        <w:rPr>
-          <w:rFonts w:ascii="Times New Roman" w:hAnsi="Times New Roman" w:cs="Times New Roman"/>
-        </w:rPr>
-        <w:t>, not modifying any transform class</w:t>
+        <w:t>Adding/removing/reordering stages requires only changing the list passed to TransformationPipeline, not modifying any transform class</w:t>
       </w:r>
     </w:p>
     <w:p>
@@ -5893,43 +4759,15 @@
         <w:rPr>
           <w:rFonts w:ascii="Times New Roman" w:hAnsi="Times New Roman" w:cs="Times New Roman"/>
         </w:rPr>
-        <w:t>Type-checked at construction: non-</w:t>
-      </w:r>
-      <w:proofErr w:type="spellStart"/>
-      <w:r>
+        <w:t>Type-checked at construction: non-RDDTransformation objects raise TypeError immediately</w:t>
+      </w:r>
+    </w:p>
+    <w:p>
+      <w:pPr>
+        <w:pStyle w:val="Heading3"/>
         <w:rPr>
           <w:rFonts w:ascii="Times New Roman" w:hAnsi="Times New Roman" w:cs="Times New Roman"/>
         </w:rPr>
-        <w:t>RDDTransformation</w:t>
-      </w:r>
-      <w:proofErr w:type="spellEnd"/>
-      <w:r>
-        <w:rPr>
-          <w:rFonts w:ascii="Times New Roman" w:hAnsi="Times New Roman" w:cs="Times New Roman"/>
-        </w:rPr>
-        <w:t xml:space="preserve"> objects raise </w:t>
-      </w:r>
-      <w:proofErr w:type="spellStart"/>
-      <w:r>
-        <w:rPr>
-          <w:rFonts w:ascii="Times New Roman" w:hAnsi="Times New Roman" w:cs="Times New Roman"/>
-        </w:rPr>
-        <w:t>TypeError</w:t>
-      </w:r>
-      <w:proofErr w:type="spellEnd"/>
-      <w:r>
-        <w:rPr>
-          <w:rFonts w:ascii="Times New Roman" w:hAnsi="Times New Roman" w:cs="Times New Roman"/>
-        </w:rPr>
-        <w:t xml:space="preserve"> immediately</w:t>
-      </w:r>
-    </w:p>
-    <w:p>
-      <w:pPr>
-        <w:pStyle w:val="Heading3"/>
-        <w:rPr>
-          <w:rFonts w:ascii="Times New Roman" w:hAnsi="Times New Roman" w:cs="Times New Roman"/>
-        </w:rPr>
       </w:pPr>
       <w:bookmarkStart w:id="11" w:name="_Toc227665208"/>
       <w:r>
@@ -5947,11 +4785,9 @@
       <w:r>
         <w:t>Pattern (</w:t>
       </w:r>
-      <w:proofErr w:type="spellStart"/>
       <w:r>
         <w:t>EnricherTransform</w:t>
       </w:r>
-      <w:proofErr w:type="spellEnd"/>
       <w:r>
         <w:t>)</w:t>
       </w:r>
@@ -5975,15 +4811,7 @@
         <w:jc w:val="both"/>
       </w:pPr>
       <w:r>
-        <w:t xml:space="preserve">Dataset B is collected into a python </w:t>
-      </w:r>
-      <w:proofErr w:type="spellStart"/>
-      <w:r>
-        <w:t>dict</w:t>
-      </w:r>
-      <w:proofErr w:type="spellEnd"/>
-      <w:r>
-        <w:t xml:space="preserve"> and broadcast to all executors, and used for map-side lookups. </w:t>
+        <w:t xml:space="preserve">Dataset B is collected into a python dict and broadcast to all executors, and used for map-side lookups. </w:t>
       </w:r>
     </w:p>
     <w:p>
@@ -6149,16 +4977,12 @@
       <w:r>
         <w:t xml:space="preserve">  </w:t>
       </w:r>
-      <w:proofErr w:type="spellStart"/>
-      <w:proofErr w:type="gramStart"/>
       <w:r>
         <w:rPr>
           <w:rFonts w:ascii="Times New Roman" w:hAnsi="Times New Roman" w:cs="Times New Roman"/>
         </w:rPr>
         <w:t>spark.master</w:t>
       </w:r>
-      <w:proofErr w:type="spellEnd"/>
-      <w:proofErr w:type="gramEnd"/>
       <w:r>
         <w:rPr>
           <w:rFonts w:ascii="Times New Roman" w:hAnsi="Times New Roman" w:cs="Times New Roman"/>
@@ -6181,21 +5005,53 @@
         <w:rPr>
           <w:rFonts w:ascii="Times New Roman" w:hAnsi="Times New Roman" w:cs="Times New Roman"/>
         </w:rPr>
+        <w:t>= local[*]</w:t>
+      </w:r>
+    </w:p>
+    <w:p>
+      <w:pPr>
+        <w:spacing w:after="0"/>
+        <w:rPr>
+          <w:rFonts w:ascii="Times New Roman" w:hAnsi="Times New Roman" w:cs="Times New Roman"/>
+        </w:rPr>
+      </w:pPr>
+      <w:r>
+        <w:rPr>
+          <w:rFonts w:ascii="Times New Roman" w:hAnsi="Times New Roman" w:cs="Times New Roman"/>
+        </w:rPr>
+        <w:t xml:space="preserve">  spark.ui.enabled         </w:t>
+      </w:r>
+      <w:r>
+        <w:rPr>
+          <w:rFonts w:ascii="Times New Roman" w:hAnsi="Times New Roman" w:cs="Times New Roman"/>
+        </w:rPr>
+        <w:tab/>
+      </w:r>
+      <w:r>
+        <w:rPr>
+          <w:rFonts w:ascii="Times New Roman" w:hAnsi="Times New Roman" w:cs="Times New Roman"/>
+        </w:rPr>
         <w:t xml:space="preserve">= </w:t>
       </w:r>
-      <w:proofErr w:type="gramStart"/>
       <w:r>
         <w:rPr>
           <w:rFonts w:ascii="Times New Roman" w:hAnsi="Times New Roman" w:cs="Times New Roman"/>
         </w:rPr>
-        <w:t>local[</w:t>
-      </w:r>
-      <w:proofErr w:type="gramEnd"/>
-      <w:r>
+        <w:t>true</w:t>
+      </w:r>
+    </w:p>
+    <w:p>
+      <w:pPr>
+        <w:spacing w:after="0"/>
         <w:rPr>
           <w:rFonts w:ascii="Times New Roman" w:hAnsi="Times New Roman" w:cs="Times New Roman"/>
         </w:rPr>
-        <w:t>*]</w:t>
+      </w:pPr>
+      <w:r>
+        <w:rPr>
+          <w:rFonts w:ascii="Times New Roman" w:hAnsi="Times New Roman" w:cs="Times New Roman"/>
+        </w:rPr>
+        <w:t>  spark.sql.shuffle.partitions    = 2</w:t>
       </w:r>
     </w:p>
     <w:p>
@@ -6209,191 +5065,33 @@
         <w:rPr>
           <w:rFonts w:ascii="Times New Roman" w:hAnsi="Times New Roman" w:cs="Times New Roman"/>
         </w:rPr>
-        <w:t xml:space="preserve">  </w:t>
-      </w:r>
-      <w:proofErr w:type="spellStart"/>
+        <w:t xml:space="preserve">  spark.serializer                   </w:t>
+      </w:r>
       <w:r>
         <w:rPr>
           <w:rFonts w:ascii="Times New Roman" w:hAnsi="Times New Roman" w:cs="Times New Roman"/>
         </w:rPr>
-        <w:t>spark.</w:t>
-      </w:r>
-      <w:proofErr w:type="gramStart"/>
+        <w:tab/>
+      </w:r>
       <w:r>
         <w:rPr>
           <w:rFonts w:ascii="Times New Roman" w:hAnsi="Times New Roman" w:cs="Times New Roman"/>
         </w:rPr>
-        <w:t>ui.enabled</w:t>
-      </w:r>
-      <w:proofErr w:type="spellEnd"/>
-      <w:proofErr w:type="gramEnd"/>
-      <w:r>
+        <w:t>= org.apache.spark.serializer.KryoSerializer</w:t>
+      </w:r>
+    </w:p>
+    <w:p>
+      <w:pPr>
+        <w:spacing w:after="0"/>
         <w:rPr>
           <w:rFonts w:ascii="Times New Roman" w:hAnsi="Times New Roman" w:cs="Times New Roman"/>
         </w:rPr>
-        <w:t xml:space="preserve">         </w:t>
-      </w:r>
+      </w:pPr>
       <w:r>
         <w:rPr>
           <w:rFonts w:ascii="Times New Roman" w:hAnsi="Times New Roman" w:cs="Times New Roman"/>
         </w:rPr>
-        <w:tab/>
-      </w:r>
-      <w:r>
-        <w:rPr>
-          <w:rFonts w:ascii="Times New Roman" w:hAnsi="Times New Roman" w:cs="Times New Roman"/>
-        </w:rPr>
-        <w:t xml:space="preserve">= </w:t>
-      </w:r>
-      <w:r>
-        <w:rPr>
-          <w:rFonts w:ascii="Times New Roman" w:hAnsi="Times New Roman" w:cs="Times New Roman"/>
-        </w:rPr>
-        <w:t>true</w:t>
-      </w:r>
-    </w:p>
-    <w:p>
-      <w:pPr>
-        <w:spacing w:after="0"/>
-        <w:rPr>
-          <w:rFonts w:ascii="Times New Roman" w:hAnsi="Times New Roman" w:cs="Times New Roman"/>
-        </w:rPr>
-      </w:pPr>
-      <w:r>
-        <w:rPr>
-          <w:rFonts w:ascii="Times New Roman" w:hAnsi="Times New Roman" w:cs="Times New Roman"/>
-        </w:rPr>
-        <w:t xml:space="preserve">  </w:t>
-      </w:r>
-      <w:proofErr w:type="spellStart"/>
-      <w:proofErr w:type="gramStart"/>
-      <w:r>
-        <w:rPr>
-          <w:rFonts w:ascii="Times New Roman" w:hAnsi="Times New Roman" w:cs="Times New Roman"/>
-        </w:rPr>
-        <w:t>spark.sql.shuffle</w:t>
-      </w:r>
-      <w:proofErr w:type="gramEnd"/>
-      <w:r>
-        <w:rPr>
-          <w:rFonts w:ascii="Times New Roman" w:hAnsi="Times New Roman" w:cs="Times New Roman"/>
-        </w:rPr>
-        <w:t>.partitions</w:t>
-      </w:r>
-      <w:proofErr w:type="spellEnd"/>
-      <w:r>
-        <w:rPr>
-          <w:rFonts w:ascii="Times New Roman" w:hAnsi="Times New Roman" w:cs="Times New Roman"/>
-        </w:rPr>
-        <w:t xml:space="preserve">    = 2</w:t>
-      </w:r>
-    </w:p>
-    <w:p>
-      <w:pPr>
-        <w:spacing w:after="0"/>
-        <w:rPr>
-          <w:rFonts w:ascii="Times New Roman" w:hAnsi="Times New Roman" w:cs="Times New Roman"/>
-        </w:rPr>
-      </w:pPr>
-      <w:r>
-        <w:rPr>
-          <w:rFonts w:ascii="Times New Roman" w:hAnsi="Times New Roman" w:cs="Times New Roman"/>
-        </w:rPr>
-        <w:t xml:space="preserve">  </w:t>
-      </w:r>
-      <w:proofErr w:type="spellStart"/>
-      <w:proofErr w:type="gramStart"/>
-      <w:r>
-        <w:rPr>
-          <w:rFonts w:ascii="Times New Roman" w:hAnsi="Times New Roman" w:cs="Times New Roman"/>
-        </w:rPr>
-        <w:t>spark.serializer</w:t>
-      </w:r>
-      <w:proofErr w:type="spellEnd"/>
-      <w:proofErr w:type="gramEnd"/>
-      <w:r>
-        <w:rPr>
-          <w:rFonts w:ascii="Times New Roman" w:hAnsi="Times New Roman" w:cs="Times New Roman"/>
-        </w:rPr>
-        <w:t xml:space="preserve">                   </w:t>
-      </w:r>
-      <w:r>
-        <w:rPr>
-          <w:rFonts w:ascii="Times New Roman" w:hAnsi="Times New Roman" w:cs="Times New Roman"/>
-        </w:rPr>
-        <w:tab/>
-      </w:r>
-      <w:r>
-        <w:rPr>
-          <w:rFonts w:ascii="Times New Roman" w:hAnsi="Times New Roman" w:cs="Times New Roman"/>
-        </w:rPr>
-        <w:t xml:space="preserve">= </w:t>
-      </w:r>
-      <w:proofErr w:type="spellStart"/>
-      <w:proofErr w:type="gramStart"/>
-      <w:r>
-        <w:rPr>
-          <w:rFonts w:ascii="Times New Roman" w:hAnsi="Times New Roman" w:cs="Times New Roman"/>
-        </w:rPr>
-        <w:t>org.apache</w:t>
-      </w:r>
-      <w:proofErr w:type="gramEnd"/>
-      <w:r>
-        <w:rPr>
-          <w:rFonts w:ascii="Times New Roman" w:hAnsi="Times New Roman" w:cs="Times New Roman"/>
-        </w:rPr>
-        <w:t>.</w:t>
-      </w:r>
-      <w:proofErr w:type="gramStart"/>
-      <w:r>
-        <w:rPr>
-          <w:rFonts w:ascii="Times New Roman" w:hAnsi="Times New Roman" w:cs="Times New Roman"/>
-        </w:rPr>
-        <w:t>spark.serializer</w:t>
-      </w:r>
-      <w:proofErr w:type="gramEnd"/>
-      <w:r>
-        <w:rPr>
-          <w:rFonts w:ascii="Times New Roman" w:hAnsi="Times New Roman" w:cs="Times New Roman"/>
-        </w:rPr>
-        <w:t>.KryoSerializer</w:t>
-      </w:r>
-      <w:proofErr w:type="spellEnd"/>
-    </w:p>
-    <w:p>
-      <w:pPr>
-        <w:spacing w:after="0"/>
-        <w:rPr>
-          <w:rFonts w:ascii="Times New Roman" w:hAnsi="Times New Roman" w:cs="Times New Roman"/>
-        </w:rPr>
-      </w:pPr>
-      <w:r>
-        <w:rPr>
-          <w:rFonts w:ascii="Times New Roman" w:hAnsi="Times New Roman" w:cs="Times New Roman"/>
-        </w:rPr>
-        <w:t xml:space="preserve">  </w:t>
-      </w:r>
-      <w:proofErr w:type="spellStart"/>
-      <w:proofErr w:type="gramStart"/>
-      <w:r>
-        <w:rPr>
-          <w:rFonts w:ascii="Times New Roman" w:hAnsi="Times New Roman" w:cs="Times New Roman"/>
-        </w:rPr>
-        <w:t>spark.driver</w:t>
-      </w:r>
-      <w:proofErr w:type="gramEnd"/>
-      <w:r>
-        <w:rPr>
-          <w:rFonts w:ascii="Times New Roman" w:hAnsi="Times New Roman" w:cs="Times New Roman"/>
-        </w:rPr>
-        <w:t>.memory</w:t>
-      </w:r>
-      <w:proofErr w:type="spellEnd"/>
-      <w:r>
-        <w:rPr>
-          <w:rFonts w:ascii="Times New Roman" w:hAnsi="Times New Roman" w:cs="Times New Roman"/>
-        </w:rPr>
-        <w:t xml:space="preserve">             = 1g</w:t>
+        <w:t>  spark.driver.memory             = 1g</w:t>
       </w:r>
     </w:p>
     <w:p>
@@ -6473,52 +5171,12 @@
                 <w:rFonts w:ascii="Times New Roman" w:hAnsi="Times New Roman" w:cs="Times New Roman"/>
               </w:rPr>
             </w:pPr>
-            <w:proofErr w:type="spellStart"/>
-            <w:proofErr w:type="gramStart"/>
-            <w:r>
-              <w:rPr>
-                <w:rFonts w:ascii="Times New Roman" w:hAnsi="Times New Roman" w:cs="Times New Roman"/>
-              </w:rPr>
-              <w:t>spark.serializer</w:t>
-            </w:r>
-            <w:proofErr w:type="spellEnd"/>
-            <w:proofErr w:type="gramEnd"/>
-            <w:r>
-              <w:rPr>
-                <w:rFonts w:ascii="Times New Roman" w:hAnsi="Times New Roman" w:cs="Times New Roman"/>
-              </w:rPr>
-              <w:t xml:space="preserve">= </w:t>
-            </w:r>
-            <w:proofErr w:type="spellStart"/>
-            <w:proofErr w:type="gramStart"/>
-            <w:r>
-              <w:rPr>
-                <w:rFonts w:ascii="Times New Roman" w:hAnsi="Times New Roman" w:cs="Times New Roman"/>
-              </w:rPr>
-              <w:t>org.apache</w:t>
-            </w:r>
-            <w:proofErr w:type="gramEnd"/>
-            <w:r>
-              <w:rPr>
-                <w:rFonts w:ascii="Times New Roman" w:hAnsi="Times New Roman" w:cs="Times New Roman"/>
-              </w:rPr>
-              <w:t>.</w:t>
-            </w:r>
-            <w:proofErr w:type="gramStart"/>
-            <w:r>
-              <w:rPr>
-                <w:rFonts w:ascii="Times New Roman" w:hAnsi="Times New Roman" w:cs="Times New Roman"/>
-              </w:rPr>
-              <w:t>spark.serializer</w:t>
-            </w:r>
-            <w:proofErr w:type="gramEnd"/>
-            <w:r>
-              <w:rPr>
-                <w:rFonts w:ascii="Times New Roman" w:hAnsi="Times New Roman" w:cs="Times New Roman"/>
-              </w:rPr>
-              <w:t>.KryoSerializer</w:t>
-            </w:r>
-            <w:proofErr w:type="spellEnd"/>
+            <w:r>
+              <w:rPr>
+                <w:rFonts w:ascii="Times New Roman" w:hAnsi="Times New Roman" w:cs="Times New Roman"/>
+              </w:rPr>
+              <w:t>spark.serializer= org.apache.spark.serializer.KryoSerializer</w:t>
+            </w:r>
           </w:p>
           <w:p>
             <w:pPr>
@@ -6564,27 +5222,11 @@
                 <w:rFonts w:ascii="Times New Roman" w:hAnsi="Times New Roman" w:cs="Times New Roman"/>
               </w:rPr>
             </w:pPr>
-            <w:proofErr w:type="spellStart"/>
-            <w:proofErr w:type="gramStart"/>
-            <w:r>
-              <w:rPr>
-                <w:rFonts w:ascii="Times New Roman" w:hAnsi="Times New Roman" w:cs="Times New Roman"/>
-              </w:rPr>
-              <w:t>spark.sql.shuffle</w:t>
-            </w:r>
-            <w:proofErr w:type="gramEnd"/>
-            <w:r>
-              <w:rPr>
-                <w:rFonts w:ascii="Times New Roman" w:hAnsi="Times New Roman" w:cs="Times New Roman"/>
-              </w:rPr>
-              <w:t>.partitions</w:t>
-            </w:r>
-            <w:proofErr w:type="spellEnd"/>
-            <w:r>
-              <w:rPr>
-                <w:rFonts w:ascii="Times New Roman" w:hAnsi="Times New Roman" w:cs="Times New Roman"/>
-              </w:rPr>
-              <w:t>= 2</w:t>
+            <w:r>
+              <w:rPr>
+                <w:rFonts w:ascii="Times New Roman" w:hAnsi="Times New Roman" w:cs="Times New Roman"/>
+              </w:rPr>
+              <w:t>spark.sql.shuffle.partitions= 2</w:t>
             </w:r>
           </w:p>
           <w:p>
@@ -6655,27 +5297,11 @@
                 <w:rFonts w:ascii="Times New Roman" w:hAnsi="Times New Roman" w:cs="Times New Roman"/>
               </w:rPr>
             </w:pPr>
-            <w:proofErr w:type="spellStart"/>
-            <w:proofErr w:type="gramStart"/>
-            <w:r>
-              <w:rPr>
-                <w:rFonts w:ascii="Times New Roman" w:hAnsi="Times New Roman" w:cs="Times New Roman"/>
-              </w:rPr>
-              <w:t>spark.driver</w:t>
-            </w:r>
-            <w:proofErr w:type="gramEnd"/>
-            <w:r>
-              <w:rPr>
-                <w:rFonts w:ascii="Times New Roman" w:hAnsi="Times New Roman" w:cs="Times New Roman"/>
-              </w:rPr>
-              <w:t>.memory</w:t>
-            </w:r>
-            <w:proofErr w:type="spellEnd"/>
-            <w:r>
-              <w:rPr>
-                <w:rFonts w:ascii="Times New Roman" w:hAnsi="Times New Roman" w:cs="Times New Roman"/>
-              </w:rPr>
-              <w:t>= 1g</w:t>
+            <w:r>
+              <w:rPr>
+                <w:rFonts w:ascii="Times New Roman" w:hAnsi="Times New Roman" w:cs="Times New Roman"/>
+              </w:rPr>
+              <w:t>spark.driver.memory= 1g</w:t>
             </w:r>
           </w:p>
         </w:tc>
@@ -6790,29 +5416,14 @@
       <w:r>
         <w:t xml:space="preserve">  </w:t>
       </w:r>
-      <w:proofErr w:type="spellStart"/>
-      <w:proofErr w:type="gramStart"/>
-      <w:r>
-        <w:t>spark.master</w:t>
-      </w:r>
-      <w:proofErr w:type="spellEnd"/>
-      <w:proofErr w:type="gramEnd"/>
-      <w:r>
-        <w:t xml:space="preserve">                       </w:t>
+      <w:r>
+        <w:t xml:space="preserve">spark.master                       </w:t>
       </w:r>
       <w:r>
         <w:tab/>
       </w:r>
       <w:r>
-        <w:t xml:space="preserve">= </w:t>
-      </w:r>
-      <w:proofErr w:type="gramStart"/>
-      <w:r>
-        <w:t>local[</w:t>
-      </w:r>
-      <w:proofErr w:type="gramEnd"/>
-      <w:r>
-        <w:t>*] or yarn</w:t>
+        <w:t>= local[*] or yarn</w:t>
       </w:r>
     </w:p>
     <w:p>
@@ -6820,60 +5431,22 @@
         <w:spacing w:after="0"/>
       </w:pPr>
       <w:r>
-        <w:t xml:space="preserve">  </w:t>
-      </w:r>
-      <w:proofErr w:type="spellStart"/>
-      <w:proofErr w:type="gramStart"/>
-      <w:r>
-        <w:t>spark.serializer</w:t>
-      </w:r>
-      <w:proofErr w:type="spellEnd"/>
-      <w:proofErr w:type="gramEnd"/>
-      <w:r>
-        <w:t xml:space="preserve">                   </w:t>
+        <w:t xml:space="preserve">  spark.serializer                   </w:t>
       </w:r>
       <w:r>
         <w:tab/>
       </w:r>
       <w:r>
-        <w:t xml:space="preserve">= </w:t>
-      </w:r>
-      <w:proofErr w:type="spellStart"/>
-      <w:proofErr w:type="gramStart"/>
-      <w:r>
-        <w:t>org.apache</w:t>
-      </w:r>
-      <w:proofErr w:type="gramEnd"/>
-      <w:r>
-        <w:t>.</w:t>
-      </w:r>
-      <w:proofErr w:type="gramStart"/>
-      <w:r>
-        <w:t>spark.serializer</w:t>
-      </w:r>
-      <w:proofErr w:type="gramEnd"/>
-      <w:r>
-        <w:t>.KryoSerializer</w:t>
-      </w:r>
-      <w:proofErr w:type="spellEnd"/>
+        <w:t>= org.apache.spark.serializer.KryoSerializer</w:t>
+      </w:r>
     </w:p>
     <w:p>
       <w:pPr>
         <w:spacing w:after="0"/>
       </w:pPr>
       <w:r>
-        <w:t xml:space="preserve">  </w:t>
-      </w:r>
-      <w:proofErr w:type="spellStart"/>
-      <w:proofErr w:type="gramStart"/>
-      <w:r>
-        <w:t>spark.sql.shuffle</w:t>
-      </w:r>
-      <w:proofErr w:type="gramEnd"/>
-      <w:r>
-        <w:t>.partitions</w:t>
-      </w:r>
-      <w:proofErr w:type="spellEnd"/>
+        <w:t>  spark.sql.shuffle.partitions</w:t>
+      </w:r>
       <w:r>
         <w:tab/>
       </w:r>
@@ -6886,18 +5459,8 @@
         <w:spacing w:after="0"/>
       </w:pPr>
       <w:r>
-        <w:t xml:space="preserve">  </w:t>
-      </w:r>
-      <w:proofErr w:type="spellStart"/>
-      <w:r>
-        <w:t>spark.</w:t>
-      </w:r>
-      <w:proofErr w:type="gramStart"/>
-      <w:r>
-        <w:t>default.parallelism</w:t>
-      </w:r>
-      <w:proofErr w:type="spellEnd"/>
-      <w:proofErr w:type="gramEnd"/>
+        <w:t>  spark.default.parallelism</w:t>
+      </w:r>
       <w:r>
         <w:tab/>
       </w:r>
@@ -6910,18 +5473,8 @@
         <w:spacing w:after="0"/>
       </w:pPr>
       <w:r>
-        <w:t xml:space="preserve">  </w:t>
-      </w:r>
-      <w:proofErr w:type="spellStart"/>
-      <w:proofErr w:type="gramStart"/>
-      <w:r>
-        <w:t>spark.driver</w:t>
-      </w:r>
-      <w:proofErr w:type="gramEnd"/>
-      <w:r>
-        <w:t>.memory</w:t>
-      </w:r>
-      <w:proofErr w:type="spellEnd"/>
+        <w:t>  spark.driver.memory</w:t>
+      </w:r>
       <w:r>
         <w:tab/>
       </w:r>
@@ -6937,18 +5490,8 @@
         <w:spacing w:after="0"/>
       </w:pPr>
       <w:r>
-        <w:t xml:space="preserve">  </w:t>
-      </w:r>
-      <w:proofErr w:type="spellStart"/>
-      <w:proofErr w:type="gramStart"/>
-      <w:r>
-        <w:t>spark.executor</w:t>
-      </w:r>
-      <w:proofErr w:type="gramEnd"/>
-      <w:r>
-        <w:t>.memory</w:t>
-      </w:r>
-      <w:proofErr w:type="spellEnd"/>
+        <w:t>  spark.executor.memory</w:t>
+      </w:r>
       <w:r>
         <w:tab/>
       </w:r>
@@ -6961,20 +5504,7 @@
         <w:spacing w:after="0"/>
       </w:pPr>
       <w:r>
-        <w:t xml:space="preserve">  </w:t>
-      </w:r>
-      <w:proofErr w:type="spellStart"/>
-      <w:proofErr w:type="gramStart"/>
-      <w:r>
-        <w:t>spark.executor</w:t>
-      </w:r>
-      <w:proofErr w:type="gramEnd"/>
-      <w:r>
-        <w:t>.cores</w:t>
-      </w:r>
-      <w:proofErr w:type="spellEnd"/>
-      <w:r>
-        <w:t xml:space="preserve">               = 2</w:t>
+        <w:t>  spark.executor.cores               = 2</w:t>
       </w:r>
     </w:p>
     <w:p>
@@ -6982,17 +5512,7 @@
         <w:spacing w:after="0"/>
       </w:pPr>
       <w:r>
-        <w:t xml:space="preserve">  </w:t>
-      </w:r>
-      <w:proofErr w:type="spellStart"/>
-      <w:proofErr w:type="gramStart"/>
-      <w:r>
-        <w:t>spark.rdd.compress</w:t>
-      </w:r>
-      <w:proofErr w:type="spellEnd"/>
-      <w:proofErr w:type="gramEnd"/>
-      <w:r>
-        <w:t xml:space="preserve">                 = true</w:t>
+        <w:t>  spark.rdd.compress                 = true</w:t>
       </w:r>
     </w:p>
     <w:p>
@@ -7000,18 +5520,8 @@
         <w:spacing w:after="0"/>
       </w:pPr>
       <w:r>
-        <w:t xml:space="preserve">  </w:t>
-      </w:r>
-      <w:proofErr w:type="spellStart"/>
-      <w:proofErr w:type="gramStart"/>
-      <w:r>
-        <w:t>spark.shuffle</w:t>
-      </w:r>
-      <w:proofErr w:type="gramEnd"/>
-      <w:r>
-        <w:t>.compress</w:t>
-      </w:r>
-      <w:proofErr w:type="spellEnd"/>
+        <w:t>  spark.shuffle.compress</w:t>
+      </w:r>
       <w:r>
         <w:tab/>
         <w:t xml:space="preserve"> </w:t>
@@ -7025,23 +5535,8 @@
         <w:spacing w:after="0"/>
       </w:pPr>
       <w:r>
-        <w:t xml:space="preserve">  </w:t>
-      </w:r>
-      <w:proofErr w:type="spellStart"/>
-      <w:proofErr w:type="gramStart"/>
-      <w:r>
-        <w:t>spark.shuffle</w:t>
-      </w:r>
-      <w:proofErr w:type="gramEnd"/>
-      <w:r>
-        <w:t>.</w:t>
-      </w:r>
-      <w:proofErr w:type="gramStart"/>
-      <w:r>
-        <w:t>spill.compress</w:t>
-      </w:r>
-      <w:proofErr w:type="spellEnd"/>
-      <w:proofErr w:type="gramEnd"/>
+        <w:t>  spark.shuffle.spill.compress</w:t>
+      </w:r>
       <w:r>
         <w:tab/>
         <w:t xml:space="preserve"> </w:t>
@@ -7055,20 +5550,7 @@
         <w:spacing w:after="0"/>
       </w:pPr>
       <w:r>
-        <w:t xml:space="preserve">  </w:t>
-      </w:r>
-      <w:proofErr w:type="spellStart"/>
-      <w:proofErr w:type="gramStart"/>
-      <w:r>
-        <w:t>spark.sql.adaptive</w:t>
-      </w:r>
-      <w:proofErr w:type="gramEnd"/>
-      <w:r>
-        <w:t>.enabled</w:t>
-      </w:r>
-      <w:proofErr w:type="spellEnd"/>
-      <w:r>
-        <w:t xml:space="preserve"> </w:t>
+        <w:t xml:space="preserve">  spark.sql.adaptive.enabled </w:t>
       </w:r>
       <w:r>
         <w:t xml:space="preserve">   </w:t>
@@ -7147,52 +5629,12 @@
                 <w:rFonts w:ascii="Times New Roman" w:hAnsi="Times New Roman" w:cs="Times New Roman"/>
               </w:rPr>
             </w:pPr>
-            <w:proofErr w:type="spellStart"/>
-            <w:proofErr w:type="gramStart"/>
-            <w:r>
-              <w:rPr>
-                <w:rFonts w:ascii="Times New Roman" w:hAnsi="Times New Roman" w:cs="Times New Roman"/>
-              </w:rPr>
-              <w:t>spark.serializer</w:t>
-            </w:r>
-            <w:proofErr w:type="spellEnd"/>
-            <w:proofErr w:type="gramEnd"/>
-            <w:r>
-              <w:rPr>
-                <w:rFonts w:ascii="Times New Roman" w:hAnsi="Times New Roman" w:cs="Times New Roman"/>
-              </w:rPr>
-              <w:t xml:space="preserve">= </w:t>
-            </w:r>
-            <w:proofErr w:type="spellStart"/>
-            <w:proofErr w:type="gramStart"/>
-            <w:r>
-              <w:rPr>
-                <w:rFonts w:ascii="Times New Roman" w:hAnsi="Times New Roman" w:cs="Times New Roman"/>
-              </w:rPr>
-              <w:t>org.apache</w:t>
-            </w:r>
-            <w:proofErr w:type="gramEnd"/>
-            <w:r>
-              <w:rPr>
-                <w:rFonts w:ascii="Times New Roman" w:hAnsi="Times New Roman" w:cs="Times New Roman"/>
-              </w:rPr>
-              <w:t>.</w:t>
-            </w:r>
-            <w:proofErr w:type="gramStart"/>
-            <w:r>
-              <w:rPr>
-                <w:rFonts w:ascii="Times New Roman" w:hAnsi="Times New Roman" w:cs="Times New Roman"/>
-              </w:rPr>
-              <w:t>spark.serializer</w:t>
-            </w:r>
-            <w:proofErr w:type="gramEnd"/>
-            <w:r>
-              <w:rPr>
-                <w:rFonts w:ascii="Times New Roman" w:hAnsi="Times New Roman" w:cs="Times New Roman"/>
-              </w:rPr>
-              <w:t>.KryoSerializer</w:t>
-            </w:r>
-            <w:proofErr w:type="spellEnd"/>
+            <w:r>
+              <w:rPr>
+                <w:rFonts w:ascii="Times New Roman" w:hAnsi="Times New Roman" w:cs="Times New Roman"/>
+              </w:rPr>
+              <w:t>spark.serializer= org.apache.spark.serializer.KryoSerializer</w:t>
+            </w:r>
           </w:p>
           <w:p>
             <w:pPr>
@@ -7238,27 +5680,11 @@
                 <w:rFonts w:ascii="Times New Roman" w:hAnsi="Times New Roman" w:cs="Times New Roman"/>
               </w:rPr>
             </w:pPr>
-            <w:proofErr w:type="spellStart"/>
-            <w:proofErr w:type="gramStart"/>
-            <w:r>
-              <w:rPr>
-                <w:rFonts w:ascii="Times New Roman" w:hAnsi="Times New Roman" w:cs="Times New Roman"/>
-              </w:rPr>
-              <w:t>spark.sql.shuffle</w:t>
-            </w:r>
-            <w:proofErr w:type="gramEnd"/>
-            <w:r>
-              <w:rPr>
-                <w:rFonts w:ascii="Times New Roman" w:hAnsi="Times New Roman" w:cs="Times New Roman"/>
-              </w:rPr>
-              <w:t>.partitions</w:t>
-            </w:r>
-            <w:proofErr w:type="spellEnd"/>
-            <w:r>
-              <w:rPr>
-                <w:rFonts w:ascii="Times New Roman" w:hAnsi="Times New Roman" w:cs="Times New Roman"/>
-              </w:rPr>
-              <w:t xml:space="preserve">= </w:t>
+            <w:r>
+              <w:rPr>
+                <w:rFonts w:ascii="Times New Roman" w:hAnsi="Times New Roman" w:cs="Times New Roman"/>
+              </w:rPr>
+              <w:t xml:space="preserve">spark.sql.shuffle.partitions= </w:t>
             </w:r>
             <w:r>
               <w:rPr>
@@ -7274,27 +5700,11 @@
                 <w:rFonts w:ascii="Times New Roman" w:hAnsi="Times New Roman" w:cs="Times New Roman"/>
               </w:rPr>
             </w:pPr>
-            <w:proofErr w:type="spellStart"/>
-            <w:r>
-              <w:rPr>
-                <w:rFonts w:ascii="Times New Roman" w:hAnsi="Times New Roman" w:cs="Times New Roman"/>
-              </w:rPr>
-              <w:t>spark.</w:t>
-            </w:r>
-            <w:proofErr w:type="gramStart"/>
-            <w:r>
-              <w:rPr>
-                <w:rFonts w:ascii="Times New Roman" w:hAnsi="Times New Roman" w:cs="Times New Roman"/>
-              </w:rPr>
-              <w:t>default.parallelism</w:t>
-            </w:r>
-            <w:proofErr w:type="spellEnd"/>
-            <w:proofErr w:type="gramEnd"/>
-            <w:r>
-              <w:rPr>
-                <w:rFonts w:ascii="Times New Roman" w:hAnsi="Times New Roman" w:cs="Times New Roman"/>
-              </w:rPr>
-              <w:t xml:space="preserve">   = 64</w:t>
+            <w:r>
+              <w:rPr>
+                <w:rFonts w:ascii="Times New Roman" w:hAnsi="Times New Roman" w:cs="Times New Roman"/>
+              </w:rPr>
+              <w:t>spark.default.parallelism   = 64</w:t>
             </w:r>
           </w:p>
           <w:p>
@@ -7391,27 +5801,11 @@
                 <w:rFonts w:ascii="Times New Roman" w:hAnsi="Times New Roman" w:cs="Times New Roman"/>
               </w:rPr>
             </w:pPr>
-            <w:proofErr w:type="spellStart"/>
-            <w:proofErr w:type="gramStart"/>
-            <w:r>
-              <w:rPr>
-                <w:rFonts w:ascii="Times New Roman" w:hAnsi="Times New Roman" w:cs="Times New Roman"/>
-              </w:rPr>
-              <w:t>spark.driver</w:t>
-            </w:r>
-            <w:proofErr w:type="gramEnd"/>
-            <w:r>
-              <w:rPr>
-                <w:rFonts w:ascii="Times New Roman" w:hAnsi="Times New Roman" w:cs="Times New Roman"/>
-              </w:rPr>
-              <w:t>.memory</w:t>
-            </w:r>
-            <w:proofErr w:type="spellEnd"/>
-            <w:r>
-              <w:rPr>
-                <w:rFonts w:ascii="Times New Roman" w:hAnsi="Times New Roman" w:cs="Times New Roman"/>
-              </w:rPr>
-              <w:t xml:space="preserve">= </w:t>
+            <w:r>
+              <w:rPr>
+                <w:rFonts w:ascii="Times New Roman" w:hAnsi="Times New Roman" w:cs="Times New Roman"/>
+              </w:rPr>
+              <w:t xml:space="preserve">spark.driver.memory= </w:t>
             </w:r>
             <w:r>
               <w:rPr>
@@ -7432,21 +5826,11 @@
                 <w:rFonts w:ascii="Times New Roman" w:hAnsi="Times New Roman" w:cs="Times New Roman"/>
               </w:rPr>
             </w:pPr>
-            <w:proofErr w:type="spellStart"/>
-            <w:proofErr w:type="gramStart"/>
-            <w:r>
-              <w:t>spark.executor</w:t>
-            </w:r>
-            <w:proofErr w:type="gramEnd"/>
-            <w:r>
-              <w:t>.memor</w:t>
-            </w:r>
-            <w:r>
-              <w:t>y</w:t>
-            </w:r>
-            <w:proofErr w:type="spellEnd"/>
-            <w:r>
-              <w:t xml:space="preserve"> </w:t>
+            <w:r>
+              <w:t>spark.executor.memor</w:t>
+            </w:r>
+            <w:r>
+              <w:t xml:space="preserve">y </w:t>
             </w:r>
             <w:r>
               <w:t>= 4g</w:t>
@@ -7538,21 +5922,7 @@
               <w:rPr>
                 <w:rFonts w:ascii="Times New Roman" w:hAnsi="Times New Roman" w:cs="Times New Roman"/>
               </w:rPr>
-              <w:t xml:space="preserve">4g executor memory can easily accommodate </w:t>
-            </w:r>
-            <w:proofErr w:type="spellStart"/>
-            <w:r>
-              <w:rPr>
-                <w:rFonts w:ascii="Times New Roman" w:hAnsi="Times New Roman" w:cs="Times New Roman"/>
-              </w:rPr>
-              <w:t>groupByKey</w:t>
-            </w:r>
-            <w:proofErr w:type="spellEnd"/>
-            <w:r>
-              <w:rPr>
-                <w:rFonts w:ascii="Times New Roman" w:hAnsi="Times New Roman" w:cs="Times New Roman"/>
-              </w:rPr>
-              <w:t xml:space="preserve"> for ranking and broadcast variable.</w:t>
+              <w:t>4g executor memory can easily accommodate groupByKey for ranking and broadcast variable.</w:t>
             </w:r>
           </w:p>
           <w:p>
@@ -7577,21 +5947,11 @@
                 <w:rFonts w:ascii="Times New Roman" w:hAnsi="Times New Roman" w:cs="Times New Roman"/>
               </w:rPr>
             </w:pPr>
-            <w:proofErr w:type="spellStart"/>
-            <w:proofErr w:type="gramStart"/>
-            <w:r>
-              <w:rPr>
-                <w:rFonts w:ascii="Times New Roman" w:hAnsi="Times New Roman" w:cs="Times New Roman"/>
-              </w:rPr>
-              <w:t>spark.rdd.compress</w:t>
-            </w:r>
-            <w:proofErr w:type="spellEnd"/>
-            <w:proofErr w:type="gramEnd"/>
-            <w:r>
-              <w:rPr>
-                <w:rFonts w:ascii="Times New Roman" w:hAnsi="Times New Roman" w:cs="Times New Roman"/>
-              </w:rPr>
-              <w:t xml:space="preserve">      </w:t>
+            <w:r>
+              <w:rPr>
+                <w:rFonts w:ascii="Times New Roman" w:hAnsi="Times New Roman" w:cs="Times New Roman"/>
+              </w:rPr>
+              <w:t>spark.rdd.compress      </w:t>
             </w:r>
             <w:r>
               <w:rPr>
@@ -7612,27 +5972,11 @@
                 <w:rFonts w:ascii="Times New Roman" w:hAnsi="Times New Roman" w:cs="Times New Roman"/>
               </w:rPr>
             </w:pPr>
-            <w:proofErr w:type="spellStart"/>
-            <w:proofErr w:type="gramStart"/>
-            <w:r>
-              <w:rPr>
-                <w:rFonts w:ascii="Times New Roman" w:hAnsi="Times New Roman" w:cs="Times New Roman"/>
-              </w:rPr>
-              <w:t>spark.shuffle</w:t>
-            </w:r>
-            <w:proofErr w:type="gramEnd"/>
-            <w:r>
-              <w:rPr>
-                <w:rFonts w:ascii="Times New Roman" w:hAnsi="Times New Roman" w:cs="Times New Roman"/>
-              </w:rPr>
-              <w:t>.compress</w:t>
-            </w:r>
-            <w:proofErr w:type="spellEnd"/>
-            <w:r>
-              <w:rPr>
-                <w:rFonts w:ascii="Times New Roman" w:hAnsi="Times New Roman" w:cs="Times New Roman"/>
-              </w:rPr>
-              <w:t xml:space="preserve">   </w:t>
+            <w:r>
+              <w:rPr>
+                <w:rFonts w:ascii="Times New Roman" w:hAnsi="Times New Roman" w:cs="Times New Roman"/>
+              </w:rPr>
+              <w:t xml:space="preserve">spark.shuffle.compress   </w:t>
             </w:r>
             <w:r>
               <w:rPr>
@@ -7653,35 +5997,11 @@
                 <w:rFonts w:ascii="Times New Roman" w:hAnsi="Times New Roman" w:cs="Times New Roman"/>
               </w:rPr>
             </w:pPr>
-            <w:proofErr w:type="spellStart"/>
-            <w:proofErr w:type="gramStart"/>
-            <w:r>
-              <w:rPr>
-                <w:rFonts w:ascii="Times New Roman" w:hAnsi="Times New Roman" w:cs="Times New Roman"/>
-              </w:rPr>
-              <w:t>spark.shuffle</w:t>
-            </w:r>
-            <w:proofErr w:type="gramEnd"/>
-            <w:r>
-              <w:rPr>
-                <w:rFonts w:ascii="Times New Roman" w:hAnsi="Times New Roman" w:cs="Times New Roman"/>
-              </w:rPr>
-              <w:t>.</w:t>
-            </w:r>
-            <w:proofErr w:type="gramStart"/>
-            <w:r>
-              <w:rPr>
-                <w:rFonts w:ascii="Times New Roman" w:hAnsi="Times New Roman" w:cs="Times New Roman"/>
-              </w:rPr>
-              <w:t>spill.compress</w:t>
-            </w:r>
-            <w:proofErr w:type="spellEnd"/>
-            <w:proofErr w:type="gramEnd"/>
-            <w:r>
-              <w:rPr>
-                <w:rFonts w:ascii="Times New Roman" w:hAnsi="Times New Roman" w:cs="Times New Roman"/>
-              </w:rPr>
-              <w:t xml:space="preserve"> = true</w:t>
+            <w:r>
+              <w:rPr>
+                <w:rFonts w:ascii="Times New Roman" w:hAnsi="Times New Roman" w:cs="Times New Roman"/>
+              </w:rPr>
+              <w:t>spark.shuffle.spill.compress = true</w:t>
             </w:r>
           </w:p>
           <w:p>
@@ -7766,28 +6086,12 @@
                 <w:rFonts w:ascii="Times New Roman" w:hAnsi="Times New Roman" w:cs="Times New Roman"/>
               </w:rPr>
             </w:pPr>
-            <w:proofErr w:type="spellStart"/>
-            <w:proofErr w:type="gramStart"/>
             <w:r>
               <w:rPr>
                 <w:rFonts w:ascii="Times New Roman" w:hAnsi="Times New Roman" w:cs="Times New Roman"/>
               </w:rPr>
               <w:lastRenderedPageBreak/>
-              <w:t>spark.sql.adaptive</w:t>
-            </w:r>
-            <w:proofErr w:type="gramEnd"/>
-            <w:r>
-              <w:rPr>
-                <w:rFonts w:ascii="Times New Roman" w:hAnsi="Times New Roman" w:cs="Times New Roman"/>
-              </w:rPr>
-              <w:t>.enabled</w:t>
-            </w:r>
-            <w:proofErr w:type="spellEnd"/>
-            <w:r>
-              <w:rPr>
-                <w:rFonts w:ascii="Times New Roman" w:hAnsi="Times New Roman" w:cs="Times New Roman"/>
-              </w:rPr>
-              <w:t xml:space="preserve">    </w:t>
+              <w:t>spark.sql.adaptive.enabled    </w:t>
             </w:r>
             <w:r>
               <w:rPr>
@@ -7912,15 +6216,8 @@
         <w:spacing w:after="0"/>
       </w:pPr>
       <w:r>
-        <w:t xml:space="preserve">  </w:t>
-      </w:r>
-      <w:proofErr w:type="spellStart"/>
-      <w:proofErr w:type="gramStart"/>
-      <w:r>
-        <w:t>spark.master</w:t>
-      </w:r>
-      <w:proofErr w:type="spellEnd"/>
-      <w:proofErr w:type="gramEnd"/>
+        <w:t xml:space="preserve">  spark.master</w:t>
+      </w:r>
       <w:r>
         <w:tab/>
       </w:r>
@@ -7937,18 +6234,8 @@
         <w:spacing w:after="0"/>
       </w:pPr>
       <w:r>
-        <w:t xml:space="preserve">  </w:t>
-      </w:r>
-      <w:proofErr w:type="spellStart"/>
-      <w:r>
-        <w:t>spark.</w:t>
-      </w:r>
-      <w:proofErr w:type="gramStart"/>
-      <w:r>
-        <w:t>deploy.mode</w:t>
-      </w:r>
-      <w:proofErr w:type="spellEnd"/>
-      <w:proofErr w:type="gramEnd"/>
+        <w:t xml:space="preserve">  spark.deploy.mode</w:t>
+      </w:r>
       <w:r>
         <w:tab/>
       </w:r>
@@ -7962,15 +6249,8 @@
         <w:spacing w:after="0"/>
       </w:pPr>
       <w:r>
-        <w:t xml:space="preserve">  </w:t>
-      </w:r>
-      <w:proofErr w:type="spellStart"/>
-      <w:proofErr w:type="gramStart"/>
-      <w:r>
-        <w:t>spark.num.executors</w:t>
-      </w:r>
-      <w:proofErr w:type="spellEnd"/>
-      <w:proofErr w:type="gramEnd"/>
+        <w:t xml:space="preserve">  spark.num.executors</w:t>
+      </w:r>
       <w:r>
         <w:tab/>
       </w:r>
@@ -7984,18 +6264,8 @@
         <w:spacing w:after="0"/>
       </w:pPr>
       <w:r>
-        <w:t xml:space="preserve">  </w:t>
-      </w:r>
-      <w:proofErr w:type="spellStart"/>
-      <w:proofErr w:type="gramStart"/>
-      <w:r>
-        <w:t>spark.executor</w:t>
-      </w:r>
-      <w:proofErr w:type="gramEnd"/>
-      <w:r>
-        <w:t>.cores</w:t>
-      </w:r>
-      <w:proofErr w:type="spellEnd"/>
+        <w:t xml:space="preserve">  spark.executor.cores</w:t>
+      </w:r>
       <w:r>
         <w:tab/>
       </w:r>
@@ -8009,18 +6279,8 @@
         <w:spacing w:after="0"/>
       </w:pPr>
       <w:r>
-        <w:t xml:space="preserve">  </w:t>
-      </w:r>
-      <w:proofErr w:type="spellStart"/>
-      <w:proofErr w:type="gramStart"/>
-      <w:r>
-        <w:t>spark.executor</w:t>
-      </w:r>
-      <w:proofErr w:type="gramEnd"/>
-      <w:r>
-        <w:t>.memory</w:t>
-      </w:r>
-      <w:proofErr w:type="spellEnd"/>
+        <w:t xml:space="preserve">  spark.executor.memory</w:t>
+      </w:r>
       <w:r>
         <w:tab/>
         <w:t>= 8g</w:t>
@@ -8031,20 +6291,7 @@
         <w:spacing w:after="0"/>
       </w:pPr>
       <w:r>
-        <w:t xml:space="preserve">  </w:t>
-      </w:r>
-      <w:proofErr w:type="spellStart"/>
-      <w:proofErr w:type="gramStart"/>
-      <w:r>
-        <w:t>spark.driver</w:t>
-      </w:r>
-      <w:proofErr w:type="gramEnd"/>
-      <w:r>
-        <w:t>.memory</w:t>
-      </w:r>
-      <w:proofErr w:type="spellEnd"/>
-      <w:r>
-        <w:t xml:space="preserve"> </w:t>
+        <w:t xml:space="preserve">  spark.driver.memory </w:t>
       </w:r>
       <w:r>
         <w:tab/>
@@ -8056,58 +6303,23 @@
         <w:spacing w:after="0"/>
       </w:pPr>
       <w:r>
-        <w:t xml:space="preserve">  </w:t>
-      </w:r>
-      <w:proofErr w:type="spellStart"/>
-      <w:proofErr w:type="gramStart"/>
-      <w:r>
-        <w:t>spark.serializer</w:t>
-      </w:r>
-      <w:proofErr w:type="spellEnd"/>
-      <w:proofErr w:type="gramEnd"/>
+        <w:t xml:space="preserve">  spark.serializer</w:t>
+      </w:r>
       <w:r>
         <w:tab/>
       </w:r>
       <w:r>
         <w:tab/>
-        <w:t xml:space="preserve">= </w:t>
-      </w:r>
-      <w:proofErr w:type="spellStart"/>
-      <w:proofErr w:type="gramStart"/>
-      <w:r>
-        <w:t>org.apache</w:t>
-      </w:r>
-      <w:proofErr w:type="gramEnd"/>
-      <w:r>
-        <w:t>.</w:t>
-      </w:r>
-      <w:proofErr w:type="gramStart"/>
-      <w:r>
-        <w:t>spark.serializer</w:t>
-      </w:r>
-      <w:proofErr w:type="gramEnd"/>
-      <w:r>
-        <w:t>.KryoSerializer</w:t>
-      </w:r>
-      <w:proofErr w:type="spellEnd"/>
+        <w:t>= org.apache.spark.serializer.KryoSerializer</w:t>
+      </w:r>
     </w:p>
     <w:p>
       <w:pPr>
         <w:spacing w:after="0"/>
       </w:pPr>
       <w:r>
-        <w:t xml:space="preserve">  </w:t>
-      </w:r>
-      <w:proofErr w:type="spellStart"/>
-      <w:proofErr w:type="gramStart"/>
-      <w:r>
-        <w:t>spark.sql.shuffle</w:t>
-      </w:r>
-      <w:proofErr w:type="gramEnd"/>
-      <w:r>
-        <w:t>.partitions</w:t>
-      </w:r>
-      <w:proofErr w:type="spellEnd"/>
+        <w:t xml:space="preserve">  spark.sql.shuffle.partitions</w:t>
+      </w:r>
       <w:r>
         <w:tab/>
         <w:t>= 200</w:t>
@@ -8118,18 +6330,8 @@
         <w:spacing w:after="0"/>
       </w:pPr>
       <w:r>
-        <w:t xml:space="preserve">  </w:t>
-      </w:r>
-      <w:proofErr w:type="spellStart"/>
-      <w:r>
-        <w:t>spark.</w:t>
-      </w:r>
-      <w:proofErr w:type="gramStart"/>
-      <w:r>
-        <w:t>default.parallelism</w:t>
-      </w:r>
-      <w:proofErr w:type="spellEnd"/>
-      <w:proofErr w:type="gramEnd"/>
+        <w:t xml:space="preserve">  spark.default.parallelism</w:t>
+      </w:r>
       <w:r>
         <w:tab/>
         <w:t>= 200</w:t>
@@ -8140,15 +6342,8 @@
         <w:spacing w:after="0"/>
       </w:pPr>
       <w:r>
-        <w:t xml:space="preserve">  </w:t>
-      </w:r>
-      <w:proofErr w:type="spellStart"/>
-      <w:proofErr w:type="gramStart"/>
-      <w:r>
-        <w:t>spark.rdd.compress</w:t>
-      </w:r>
-      <w:proofErr w:type="spellEnd"/>
-      <w:proofErr w:type="gramEnd"/>
+        <w:t xml:space="preserve">  spark.rdd.compress</w:t>
+      </w:r>
       <w:r>
         <w:tab/>
       </w:r>
@@ -8162,20 +6357,7 @@
         <w:spacing w:after="0"/>
       </w:pPr>
       <w:r>
-        <w:t xml:space="preserve">  </w:t>
-      </w:r>
-      <w:proofErr w:type="spellStart"/>
-      <w:proofErr w:type="gramStart"/>
-      <w:r>
-        <w:t>spark.shuffle</w:t>
-      </w:r>
-      <w:proofErr w:type="gramEnd"/>
-      <w:r>
-        <w:t>.compress</w:t>
-      </w:r>
-      <w:proofErr w:type="spellEnd"/>
-      <w:r>
-        <w:t xml:space="preserve"> </w:t>
+        <w:t xml:space="preserve">  spark.shuffle.compress </w:t>
       </w:r>
       <w:r>
         <w:tab/>
@@ -8187,25 +6369,7 @@
         <w:spacing w:after="0"/>
       </w:pPr>
       <w:r>
-        <w:t xml:space="preserve">  </w:t>
-      </w:r>
-      <w:proofErr w:type="spellStart"/>
-      <w:proofErr w:type="gramStart"/>
-      <w:r>
-        <w:t>spark.shuffle</w:t>
-      </w:r>
-      <w:proofErr w:type="gramEnd"/>
-      <w:r>
-        <w:t>.</w:t>
-      </w:r>
-      <w:proofErr w:type="gramStart"/>
-      <w:r>
-        <w:t>spill.compress</w:t>
-      </w:r>
-      <w:proofErr w:type="spellEnd"/>
-      <w:proofErr w:type="gramEnd"/>
-      <w:r>
-        <w:t xml:space="preserve"> </w:t>
+        <w:t xml:space="preserve">  spark.shuffle.spill.compress </w:t>
       </w:r>
       <w:r>
         <w:tab/>
@@ -8217,18 +6381,8 @@
         <w:spacing w:after="0"/>
       </w:pPr>
       <w:r>
-        <w:t xml:space="preserve">  </w:t>
-      </w:r>
-      <w:proofErr w:type="spellStart"/>
-      <w:proofErr w:type="gramStart"/>
-      <w:r>
-        <w:t>spark.sql.adaptive</w:t>
-      </w:r>
-      <w:proofErr w:type="gramEnd"/>
-      <w:r>
-        <w:t>.enabled</w:t>
-      </w:r>
-      <w:proofErr w:type="spellEnd"/>
+        <w:t xml:space="preserve">  spark.sql.adaptive.enabled</w:t>
+      </w:r>
       <w:r>
         <w:tab/>
         <w:t>= true</w:t>
@@ -8239,20 +6393,7 @@
         <w:spacing w:after="0"/>
       </w:pPr>
       <w:r>
-        <w:t xml:space="preserve">  </w:t>
-      </w:r>
-      <w:proofErr w:type="spellStart"/>
-      <w:proofErr w:type="gramStart"/>
-      <w:r>
-        <w:t>spark.sql.adaptive</w:t>
-      </w:r>
-      <w:proofErr w:type="gramEnd"/>
-      <w:r>
-        <w:t>.coalescePartitions.enabled</w:t>
-      </w:r>
-      <w:proofErr w:type="spellEnd"/>
-      <w:r>
-        <w:t xml:space="preserve"> = true</w:t>
+        <w:t xml:space="preserve">  spark.sql.adaptive.coalescePartitions.enabled = true</w:t>
       </w:r>
     </w:p>
     <w:p>
@@ -8260,17 +6401,7 @@
         <w:spacing w:after="0"/>
       </w:pPr>
       <w:r>
-        <w:t xml:space="preserve">  </w:t>
-      </w:r>
-      <w:proofErr w:type="spellStart"/>
-      <w:proofErr w:type="gramStart"/>
-      <w:r>
-        <w:t>spark.speculation</w:t>
-      </w:r>
-      <w:proofErr w:type="spellEnd"/>
-      <w:proofErr w:type="gramEnd"/>
-      <w:r>
-        <w:t xml:space="preserve">                   = true</w:t>
+        <w:t xml:space="preserve">  spark.speculation                   = true</w:t>
       </w:r>
     </w:p>
     <w:p>
@@ -8278,18 +6409,8 @@
         <w:spacing w:after="0"/>
       </w:pPr>
       <w:r>
-        <w:t xml:space="preserve">  </w:t>
-      </w:r>
-      <w:proofErr w:type="spellStart"/>
-      <w:proofErr w:type="gramStart"/>
-      <w:r>
-        <w:t>spark.speculation</w:t>
-      </w:r>
-      <w:proofErr w:type="gramEnd"/>
-      <w:r>
-        <w:t>.quantile</w:t>
-      </w:r>
-      <w:proofErr w:type="spellEnd"/>
+        <w:t xml:space="preserve">  spark.speculation.quantile</w:t>
+      </w:r>
       <w:r>
         <w:tab/>
         <w:t>= 0.9</w:t>
@@ -8300,17 +6421,7 @@
         <w:spacing w:after="0"/>
       </w:pPr>
       <w:r>
-        <w:t xml:space="preserve">  </w:t>
-      </w:r>
-      <w:proofErr w:type="spellStart"/>
-      <w:proofErr w:type="gramStart"/>
-      <w:r>
-        <w:t>spark.dynamicAllocation.enabled</w:t>
-      </w:r>
-      <w:proofErr w:type="spellEnd"/>
-      <w:proofErr w:type="gramEnd"/>
-      <w:r>
-        <w:t xml:space="preserve">    = true</w:t>
+        <w:t xml:space="preserve">  spark.dynamicAllocation.enabled    = true</w:t>
       </w:r>
     </w:p>
     <w:p>
@@ -8318,17 +6429,7 @@
         <w:spacing w:after="0"/>
       </w:pPr>
       <w:r>
-        <w:t xml:space="preserve">  </w:t>
-      </w:r>
-      <w:proofErr w:type="spellStart"/>
-      <w:proofErr w:type="gramStart"/>
-      <w:r>
-        <w:t>spark.dynamicAllocation.minExecutors</w:t>
-      </w:r>
-      <w:proofErr w:type="spellEnd"/>
-      <w:proofErr w:type="gramEnd"/>
-      <w:r>
-        <w:t xml:space="preserve"> = 2</w:t>
+        <w:t xml:space="preserve">  spark.dynamicAllocation.minExecutors = 2</w:t>
       </w:r>
     </w:p>
     <w:p>
@@ -8336,17 +6437,7 @@
         <w:spacing w:after="0"/>
       </w:pPr>
       <w:r>
-        <w:t xml:space="preserve">  </w:t>
-      </w:r>
-      <w:proofErr w:type="spellStart"/>
-      <w:proofErr w:type="gramStart"/>
-      <w:r>
-        <w:t>spark.dynamicAllocation.maxExecutors</w:t>
-      </w:r>
-      <w:proofErr w:type="spellEnd"/>
-      <w:proofErr w:type="gramEnd"/>
-      <w:r>
-        <w:t xml:space="preserve"> = 16</w:t>
+        <w:t xml:space="preserve">  spark.dynamicAllocation.maxExecutors = 16</w:t>
       </w:r>
     </w:p>
     <w:p>
@@ -8424,52 +6515,12 @@
                 <w:rFonts w:ascii="Times New Roman" w:hAnsi="Times New Roman" w:cs="Times New Roman"/>
               </w:rPr>
             </w:pPr>
-            <w:proofErr w:type="spellStart"/>
-            <w:proofErr w:type="gramStart"/>
-            <w:r>
-              <w:rPr>
-                <w:rFonts w:ascii="Times New Roman" w:hAnsi="Times New Roman" w:cs="Times New Roman"/>
-              </w:rPr>
-              <w:t>spark.serializer</w:t>
-            </w:r>
-            <w:proofErr w:type="spellEnd"/>
-            <w:proofErr w:type="gramEnd"/>
-            <w:r>
-              <w:rPr>
-                <w:rFonts w:ascii="Times New Roman" w:hAnsi="Times New Roman" w:cs="Times New Roman"/>
-              </w:rPr>
-              <w:t xml:space="preserve">= </w:t>
-            </w:r>
-            <w:proofErr w:type="spellStart"/>
-            <w:proofErr w:type="gramStart"/>
-            <w:r>
-              <w:rPr>
-                <w:rFonts w:ascii="Times New Roman" w:hAnsi="Times New Roman" w:cs="Times New Roman"/>
-              </w:rPr>
-              <w:t>org.apache</w:t>
-            </w:r>
-            <w:proofErr w:type="gramEnd"/>
-            <w:r>
-              <w:rPr>
-                <w:rFonts w:ascii="Times New Roman" w:hAnsi="Times New Roman" w:cs="Times New Roman"/>
-              </w:rPr>
-              <w:t>.</w:t>
-            </w:r>
-            <w:proofErr w:type="gramStart"/>
-            <w:r>
-              <w:rPr>
-                <w:rFonts w:ascii="Times New Roman" w:hAnsi="Times New Roman" w:cs="Times New Roman"/>
-              </w:rPr>
-              <w:t>spark.serializer</w:t>
-            </w:r>
-            <w:proofErr w:type="gramEnd"/>
-            <w:r>
-              <w:rPr>
-                <w:rFonts w:ascii="Times New Roman" w:hAnsi="Times New Roman" w:cs="Times New Roman"/>
-              </w:rPr>
-              <w:t>.KryoSerializer</w:t>
-            </w:r>
-            <w:proofErr w:type="spellEnd"/>
+            <w:r>
+              <w:rPr>
+                <w:rFonts w:ascii="Times New Roman" w:hAnsi="Times New Roman" w:cs="Times New Roman"/>
+              </w:rPr>
+              <w:t>spark.serializer= org.apache.spark.serializer.KryoSerializer</w:t>
+            </w:r>
           </w:p>
           <w:p>
             <w:pPr>
@@ -8515,27 +6566,11 @@
                 <w:rFonts w:ascii="Times New Roman" w:hAnsi="Times New Roman" w:cs="Times New Roman"/>
               </w:rPr>
             </w:pPr>
-            <w:proofErr w:type="spellStart"/>
-            <w:proofErr w:type="gramStart"/>
-            <w:r>
-              <w:rPr>
-                <w:rFonts w:ascii="Times New Roman" w:hAnsi="Times New Roman" w:cs="Times New Roman"/>
-              </w:rPr>
-              <w:t>spark.sql.shuffle</w:t>
-            </w:r>
-            <w:proofErr w:type="gramEnd"/>
-            <w:r>
-              <w:rPr>
-                <w:rFonts w:ascii="Times New Roman" w:hAnsi="Times New Roman" w:cs="Times New Roman"/>
-              </w:rPr>
-              <w:t>.partitions</w:t>
-            </w:r>
-            <w:proofErr w:type="spellEnd"/>
-            <w:r>
-              <w:rPr>
-                <w:rFonts w:ascii="Times New Roman" w:hAnsi="Times New Roman" w:cs="Times New Roman"/>
-              </w:rPr>
-              <w:t xml:space="preserve">= </w:t>
+            <w:r>
+              <w:rPr>
+                <w:rFonts w:ascii="Times New Roman" w:hAnsi="Times New Roman" w:cs="Times New Roman"/>
+              </w:rPr>
+              <w:t xml:space="preserve">spark.sql.shuffle.partitions= </w:t>
             </w:r>
             <w:r>
               <w:rPr>
@@ -8551,27 +6586,11 @@
                 <w:rFonts w:ascii="Times New Roman" w:hAnsi="Times New Roman" w:cs="Times New Roman"/>
               </w:rPr>
             </w:pPr>
-            <w:proofErr w:type="spellStart"/>
-            <w:r>
-              <w:rPr>
-                <w:rFonts w:ascii="Times New Roman" w:hAnsi="Times New Roman" w:cs="Times New Roman"/>
-              </w:rPr>
-              <w:t>spark.</w:t>
-            </w:r>
-            <w:proofErr w:type="gramStart"/>
-            <w:r>
-              <w:rPr>
-                <w:rFonts w:ascii="Times New Roman" w:hAnsi="Times New Roman" w:cs="Times New Roman"/>
-              </w:rPr>
-              <w:t>default.parallelism</w:t>
-            </w:r>
-            <w:proofErr w:type="spellEnd"/>
-            <w:proofErr w:type="gramEnd"/>
-            <w:r>
-              <w:rPr>
-                <w:rFonts w:ascii="Times New Roman" w:hAnsi="Times New Roman" w:cs="Times New Roman"/>
-              </w:rPr>
-              <w:t xml:space="preserve">   = </w:t>
+            <w:r>
+              <w:rPr>
+                <w:rFonts w:ascii="Times New Roman" w:hAnsi="Times New Roman" w:cs="Times New Roman"/>
+              </w:rPr>
+              <w:t xml:space="preserve">spark.default.parallelism   = </w:t>
             </w:r>
             <w:r>
               <w:rPr>
@@ -8652,15 +6671,8 @@
           </w:tcPr>
           <w:p>
             <w:r>
-              <w:t xml:space="preserve">  </w:t>
-            </w:r>
-            <w:proofErr w:type="spellStart"/>
-            <w:proofErr w:type="gramStart"/>
-            <w:r>
-              <w:t>spark.num.executors</w:t>
-            </w:r>
-            <w:proofErr w:type="spellEnd"/>
-            <w:proofErr w:type="gramEnd"/>
+              <w:t xml:space="preserve">  spark.num.executors</w:t>
+            </w:r>
             <w:r>
               <w:tab/>
             </w:r>
@@ -8671,18 +6683,8 @@
           </w:p>
           <w:p>
             <w:r>
-              <w:t xml:space="preserve">  </w:t>
-            </w:r>
-            <w:proofErr w:type="spellStart"/>
-            <w:proofErr w:type="gramStart"/>
-            <w:r>
-              <w:t>spark.executor</w:t>
-            </w:r>
-            <w:proofErr w:type="gramEnd"/>
-            <w:r>
-              <w:t>.cores</w:t>
-            </w:r>
-            <w:proofErr w:type="spellEnd"/>
+              <w:t xml:space="preserve">  spark.executor.cores</w:t>
+            </w:r>
             <w:r>
               <w:tab/>
             </w:r>
@@ -8693,18 +6695,8 @@
           </w:p>
           <w:p>
             <w:r>
-              <w:t xml:space="preserve">  </w:t>
-            </w:r>
-            <w:proofErr w:type="spellStart"/>
-            <w:proofErr w:type="gramStart"/>
-            <w:r>
-              <w:t>spark.executor</w:t>
-            </w:r>
-            <w:proofErr w:type="gramEnd"/>
-            <w:r>
-              <w:t>.memory</w:t>
-            </w:r>
-            <w:proofErr w:type="spellEnd"/>
+              <w:t xml:space="preserve">  spark.executor.memory</w:t>
+            </w:r>
             <w:r>
               <w:tab/>
               <w:t>= 8g</w:t>
@@ -8712,20 +6704,7 @@
           </w:p>
           <w:p>
             <w:r>
-              <w:t xml:space="preserve">  </w:t>
-            </w:r>
-            <w:proofErr w:type="spellStart"/>
-            <w:proofErr w:type="gramStart"/>
-            <w:r>
-              <w:t>spark.driver</w:t>
-            </w:r>
-            <w:proofErr w:type="gramEnd"/>
-            <w:r>
-              <w:t>.memory</w:t>
-            </w:r>
-            <w:proofErr w:type="spellEnd"/>
-            <w:r>
-              <w:t xml:space="preserve"> </w:t>
+              <w:t xml:space="preserve">  spark.driver.memory </w:t>
             </w:r>
             <w:r>
               <w:tab/>
@@ -8801,23 +6780,7 @@
               <w:rPr>
                 <w:rFonts w:ascii="Times New Roman" w:hAnsi="Times New Roman" w:cs="Times New Roman"/>
               </w:rPr>
-              <w:t xml:space="preserve">4 </w:t>
-            </w:r>
-            <w:proofErr w:type="spellStart"/>
-            <w:proofErr w:type="gramStart"/>
-            <w:r>
-              <w:rPr>
-                <w:rFonts w:ascii="Times New Roman" w:hAnsi="Times New Roman" w:cs="Times New Roman"/>
-              </w:rPr>
-              <w:t>executor.cores</w:t>
-            </w:r>
-            <w:proofErr w:type="spellEnd"/>
-            <w:proofErr w:type="gramEnd"/>
-            <w:r>
-              <w:rPr>
-                <w:rFonts w:ascii="Times New Roman" w:hAnsi="Times New Roman" w:cs="Times New Roman"/>
-              </w:rPr>
-              <w:t xml:space="preserve"> are typical setting for production cluster balanced with </w:t>
+              <w:t xml:space="preserve">4 executor.cores are typical setting for production cluster balanced with </w:t>
             </w:r>
             <w:r>
               <w:rPr>
@@ -8825,22 +6788,12 @@
               </w:rPr>
               <w:t xml:space="preserve">4-8 </w:t>
             </w:r>
-            <w:proofErr w:type="spellStart"/>
-            <w:proofErr w:type="gramStart"/>
             <w:r>
               <w:rPr>
                 <w:rFonts w:ascii="Times New Roman" w:hAnsi="Times New Roman" w:cs="Times New Roman"/>
               </w:rPr>
               <w:lastRenderedPageBreak/>
-              <w:t>num.executors</w:t>
-            </w:r>
-            <w:proofErr w:type="spellEnd"/>
-            <w:proofErr w:type="gramEnd"/>
-            <w:r>
-              <w:rPr>
-                <w:rFonts w:ascii="Times New Roman" w:hAnsi="Times New Roman" w:cs="Times New Roman"/>
-              </w:rPr>
-              <w:t>. This made up of total 32 cores for the cluster.</w:t>
+              <w:t>num.executors. This made up of total 32 cores for the cluster.</w:t>
             </w:r>
           </w:p>
           <w:p>
@@ -8865,22 +6818,12 @@
                 <w:rFonts w:ascii="Times New Roman" w:hAnsi="Times New Roman" w:cs="Times New Roman"/>
               </w:rPr>
             </w:pPr>
-            <w:proofErr w:type="spellStart"/>
-            <w:proofErr w:type="gramStart"/>
             <w:r>
               <w:rPr>
                 <w:rFonts w:ascii="Times New Roman" w:hAnsi="Times New Roman" w:cs="Times New Roman"/>
               </w:rPr>
               <w:lastRenderedPageBreak/>
-              <w:t>spark.rdd.compress</w:t>
-            </w:r>
-            <w:proofErr w:type="spellEnd"/>
-            <w:proofErr w:type="gramEnd"/>
-            <w:r>
-              <w:rPr>
-                <w:rFonts w:ascii="Times New Roman" w:hAnsi="Times New Roman" w:cs="Times New Roman"/>
-              </w:rPr>
-              <w:t xml:space="preserve">      </w:t>
+              <w:t>spark.rdd.compress      </w:t>
             </w:r>
             <w:r>
               <w:rPr>
@@ -8901,27 +6844,11 @@
                 <w:rFonts w:ascii="Times New Roman" w:hAnsi="Times New Roman" w:cs="Times New Roman"/>
               </w:rPr>
             </w:pPr>
-            <w:proofErr w:type="spellStart"/>
-            <w:proofErr w:type="gramStart"/>
-            <w:r>
-              <w:rPr>
-                <w:rFonts w:ascii="Times New Roman" w:hAnsi="Times New Roman" w:cs="Times New Roman"/>
-              </w:rPr>
-              <w:t>spark.shuffle</w:t>
-            </w:r>
-            <w:proofErr w:type="gramEnd"/>
-            <w:r>
-              <w:rPr>
-                <w:rFonts w:ascii="Times New Roman" w:hAnsi="Times New Roman" w:cs="Times New Roman"/>
-              </w:rPr>
-              <w:t>.compress</w:t>
-            </w:r>
-            <w:proofErr w:type="spellEnd"/>
-            <w:r>
-              <w:rPr>
-                <w:rFonts w:ascii="Times New Roman" w:hAnsi="Times New Roman" w:cs="Times New Roman"/>
-              </w:rPr>
-              <w:t xml:space="preserve">   </w:t>
+            <w:r>
+              <w:rPr>
+                <w:rFonts w:ascii="Times New Roman" w:hAnsi="Times New Roman" w:cs="Times New Roman"/>
+              </w:rPr>
+              <w:t xml:space="preserve">spark.shuffle.compress   </w:t>
             </w:r>
             <w:r>
               <w:rPr>
@@ -8942,35 +6869,11 @@
                 <w:rFonts w:ascii="Times New Roman" w:hAnsi="Times New Roman" w:cs="Times New Roman"/>
               </w:rPr>
             </w:pPr>
-            <w:proofErr w:type="spellStart"/>
-            <w:proofErr w:type="gramStart"/>
-            <w:r>
-              <w:rPr>
-                <w:rFonts w:ascii="Times New Roman" w:hAnsi="Times New Roman" w:cs="Times New Roman"/>
-              </w:rPr>
-              <w:t>spark.shuffle</w:t>
-            </w:r>
-            <w:proofErr w:type="gramEnd"/>
-            <w:r>
-              <w:rPr>
-                <w:rFonts w:ascii="Times New Roman" w:hAnsi="Times New Roman" w:cs="Times New Roman"/>
-              </w:rPr>
-              <w:t>.</w:t>
-            </w:r>
-            <w:proofErr w:type="gramStart"/>
-            <w:r>
-              <w:rPr>
-                <w:rFonts w:ascii="Times New Roman" w:hAnsi="Times New Roman" w:cs="Times New Roman"/>
-              </w:rPr>
-              <w:t>spill.compress</w:t>
-            </w:r>
-            <w:proofErr w:type="spellEnd"/>
-            <w:proofErr w:type="gramEnd"/>
-            <w:r>
-              <w:rPr>
-                <w:rFonts w:ascii="Times New Roman" w:hAnsi="Times New Roman" w:cs="Times New Roman"/>
-              </w:rPr>
-              <w:t xml:space="preserve"> = true</w:t>
+            <w:r>
+              <w:rPr>
+                <w:rFonts w:ascii="Times New Roman" w:hAnsi="Times New Roman" w:cs="Times New Roman"/>
+              </w:rPr>
+              <w:t>spark.shuffle.spill.compress = true</w:t>
             </w:r>
           </w:p>
           <w:p>
@@ -9055,27 +6958,11 @@
                 <w:rFonts w:ascii="Times New Roman" w:hAnsi="Times New Roman" w:cs="Times New Roman"/>
               </w:rPr>
             </w:pPr>
-            <w:proofErr w:type="spellStart"/>
-            <w:proofErr w:type="gramStart"/>
-            <w:r>
-              <w:rPr>
-                <w:rFonts w:ascii="Times New Roman" w:hAnsi="Times New Roman" w:cs="Times New Roman"/>
-              </w:rPr>
-              <w:t>spark.sql.adaptive</w:t>
-            </w:r>
-            <w:proofErr w:type="gramEnd"/>
-            <w:r>
-              <w:rPr>
-                <w:rFonts w:ascii="Times New Roman" w:hAnsi="Times New Roman" w:cs="Times New Roman"/>
-              </w:rPr>
-              <w:t>.enabled</w:t>
-            </w:r>
-            <w:proofErr w:type="spellEnd"/>
-            <w:r>
-              <w:rPr>
-                <w:rFonts w:ascii="Times New Roman" w:hAnsi="Times New Roman" w:cs="Times New Roman"/>
-              </w:rPr>
-              <w:t xml:space="preserve">    </w:t>
+            <w:r>
+              <w:rPr>
+                <w:rFonts w:ascii="Times New Roman" w:hAnsi="Times New Roman" w:cs="Times New Roman"/>
+              </w:rPr>
+              <w:t>spark.sql.adaptive.enabled    </w:t>
             </w:r>
             <w:r>
               <w:rPr>
@@ -9171,30 +7058,13 @@
             <w:tcW w:w="4237" w:type="dxa"/>
           </w:tcPr>
           <w:p>
-            <w:proofErr w:type="spellStart"/>
-            <w:proofErr w:type="gramStart"/>
-            <w:r>
-              <w:t>spark.speculation</w:t>
-            </w:r>
-            <w:proofErr w:type="spellEnd"/>
-            <w:proofErr w:type="gramEnd"/>
-            <w:r>
-              <w:t xml:space="preserve">                   = true</w:t>
-            </w:r>
-          </w:p>
-          <w:p>
-            <w:proofErr w:type="spellStart"/>
-            <w:proofErr w:type="gramStart"/>
-            <w:r>
-              <w:t>spark.speculation</w:t>
-            </w:r>
-            <w:proofErr w:type="gramEnd"/>
-            <w:r>
-              <w:t>.quantile</w:t>
-            </w:r>
-            <w:proofErr w:type="spellEnd"/>
-            <w:r>
-              <w:t xml:space="preserve">   = 0.75 (standard) to 0.9 (highly skewed)</w:t>
+            <w:r>
+              <w:t>spark.speculation                   = true</w:t>
+            </w:r>
+          </w:p>
+          <w:p>
+            <w:r>
+              <w:t>spark.speculation.quantile   = 0.75 (standard) to 0.9 (highly skewed)</w:t>
             </w:r>
           </w:p>
           <w:p>
@@ -9280,15 +7150,8 @@
             <w:tcW w:w="4237" w:type="dxa"/>
           </w:tcPr>
           <w:p>
-            <w:proofErr w:type="spellStart"/>
-            <w:proofErr w:type="gramStart"/>
-            <w:r>
-              <w:t>spark.dynamicAllocation.minExecutors</w:t>
-            </w:r>
-            <w:proofErr w:type="spellEnd"/>
-            <w:proofErr w:type="gramEnd"/>
-            <w:r>
-              <w:t xml:space="preserve"> </w:t>
+            <w:r>
+              <w:t xml:space="preserve">spark.dynamicAllocation.minExecutors </w:t>
             </w:r>
           </w:p>
           <w:p>
@@ -9298,17 +7161,7 @@
           </w:p>
           <w:p>
             <w:r>
-              <w:t xml:space="preserve">  </w:t>
-            </w:r>
-            <w:proofErr w:type="spellStart"/>
-            <w:proofErr w:type="gramStart"/>
-            <w:r>
-              <w:t>spark.dynamicAllocation.maxExecutors</w:t>
-            </w:r>
-            <w:proofErr w:type="spellEnd"/>
-            <w:proofErr w:type="gramEnd"/>
-            <w:r>
-              <w:t xml:space="preserve"> = 16</w:t>
+              <w:t xml:space="preserve">  spark.dynamicAllocation.maxExecutors = 16</w:t>
             </w:r>
           </w:p>
           <w:p/>
@@ -9440,35 +7293,7 @@
         <w:rPr>
           <w:rFonts w:ascii="Times New Roman" w:hAnsi="Times New Roman" w:cs="Times New Roman"/>
         </w:rPr>
-        <w:t xml:space="preserve"> by </w:t>
-      </w:r>
-      <w:proofErr w:type="spellStart"/>
-      <w:r>
-        <w:rPr>
-          <w:rFonts w:ascii="Times New Roman" w:hAnsi="Times New Roman" w:cs="Times New Roman"/>
-        </w:rPr>
-        <w:t>geo_oid</w:t>
-      </w:r>
-      <w:proofErr w:type="spellEnd"/>
-      <w:r>
-        <w:rPr>
-          <w:rFonts w:ascii="Times New Roman" w:hAnsi="Times New Roman" w:cs="Times New Roman"/>
-        </w:rPr>
-        <w:t xml:space="preserve"> or </w:t>
-      </w:r>
-      <w:proofErr w:type="spellStart"/>
-      <w:r>
-        <w:rPr>
-          <w:rFonts w:ascii="Times New Roman" w:hAnsi="Times New Roman" w:cs="Times New Roman"/>
-        </w:rPr>
-        <w:t>item_name</w:t>
-      </w:r>
-      <w:proofErr w:type="spellEnd"/>
-      <w:r>
-        <w:rPr>
-          <w:rFonts w:ascii="Times New Roman" w:hAnsi="Times New Roman" w:cs="Times New Roman"/>
-        </w:rPr>
-        <w:t xml:space="preserve">. Consider to use salting to spread the load. </w:t>
+        <w:t xml:space="preserve"> by geo_oid or item_name. Consider to use salting to spread the load. </w:t>
       </w:r>
     </w:p>
     <w:p>
@@ -9486,21 +7311,7 @@
         <w:rPr>
           <w:rFonts w:ascii="Times New Roman" w:hAnsi="Times New Roman" w:cs="Times New Roman"/>
         </w:rPr>
-        <w:t xml:space="preserve">If executors encountered Out-of-Memory error at ranking stage, consider increase executor memory or repartition before </w:t>
-      </w:r>
-      <w:proofErr w:type="spellStart"/>
-      <w:r>
-        <w:rPr>
-          <w:rFonts w:ascii="Times New Roman" w:hAnsi="Times New Roman" w:cs="Times New Roman"/>
-        </w:rPr>
-        <w:t>groupByKey</w:t>
-      </w:r>
-      <w:proofErr w:type="spellEnd"/>
-      <w:r>
-        <w:rPr>
-          <w:rFonts w:ascii="Times New Roman" w:hAnsi="Times New Roman" w:cs="Times New Roman"/>
-        </w:rPr>
-        <w:t>.</w:t>
+        <w:t>If executors encountered Out-of-Memory error at ranking stage, consider increase executor memory or repartition before groupByKey.</w:t>
       </w:r>
     </w:p>
     <w:p>

</xml_diff>